<commit_message>
docs(tarea-04): incorporar evidencias de consola de npm test y git log en informe apa 7 docx y pdf
</commit_message>
<xml_diff>
--- a/Docs/Informe_Tarea04_Gestion_Gobernanza_Riesgos.docx
+++ b/Docs/Informe_Tarea04_Gestion_Gobernanza_Riesgos.docx
@@ -9155,6 +9155,519 @@
     </w:p>
     <w:p>
       <w:pPr>
+        <w:spacing w:before="200" w:after="80" w:line="360" w:lineRule="auto"/>
+        <w:jc w:val="left"/>
+      </w:pPr>
+      <w:r>
+        <w:rPr>
+          <w:rFonts w:ascii="Times New Roman" w:hAnsi="Times New Roman"/>
+          <w:b/>
+          <w:i/>
+          <w:color w:val="334155"/>
+          <w:sz w:val="24"/>
+        </w:rPr>
+        <w:t>10.5 Evidencia de Ejecucion de Pruebas Unitarias (Captura de Consola)</w:t>
+      </w:r>
+    </w:p>
+    <w:p>
+      <w:pPr>
+        <w:spacing w:line="360" w:lineRule="auto" w:after="80" w:before="0"/>
+      </w:pPr>
+      <w:r>
+        <w:rPr>
+          <w:rFonts w:ascii="Times New Roman" w:hAnsi="Times New Roman"/>
+          <w:sz w:val="24"/>
+        </w:rPr>
+        <w:t xml:space="preserve">A continuacion se presenta la salida oficial de la suite de pruebas ejecutada en consola mediante </w:t>
+      </w:r>
+      <w:r>
+        <w:rPr>
+          <w:rFonts w:ascii="Consolas" w:hAnsi="Consolas"/>
+          <w:color w:val="C2410C"/>
+          <w:sz w:val="21"/>
+        </w:rPr>
+        <w:t>npm test</w:t>
+      </w:r>
+      <w:r>
+        <w:rPr>
+          <w:rFonts w:ascii="Times New Roman" w:hAnsi="Times New Roman"/>
+          <w:sz w:val="24"/>
+        </w:rPr>
+        <w:t xml:space="preserve"> con el reporter </w:t>
+      </w:r>
+      <w:r>
+        <w:rPr>
+          <w:rFonts w:ascii="Consolas" w:hAnsi="Consolas"/>
+          <w:color w:val="C2410C"/>
+          <w:sz w:val="21"/>
+        </w:rPr>
+        <w:t>spec</w:t>
+      </w:r>
+      <w:r>
+        <w:rPr>
+          <w:rFonts w:ascii="Times New Roman" w:hAnsi="Times New Roman"/>
+          <w:sz w:val="24"/>
+        </w:rPr>
+        <w:t>, demostrando 18 pruebas ejecutadas en 122 milisegundos con 0 fallos:</w:t>
+      </w:r>
+    </w:p>
+    <w:tbl>
+      <w:tblPr>
+        <w:tblW w:type="auto" w:w="0"/>
+        <w:jc w:val="center"/>
+        <w:tblLook w:firstColumn="1" w:firstRow="1" w:lastColumn="0" w:lastRow="0" w:noHBand="0" w:noVBand="1" w:val="04A0"/>
+      </w:tblPr>
+      <w:tblGrid>
+        <w:gridCol w:w="9360"/>
+      </w:tblGrid>
+      <w:tr>
+        <w:tc>
+          <w:tcPr>
+            <w:tcW w:type="dxa" w:w="9360"/>
+            <w:shd w:fill="F8FAFC"/>
+            <w:tcMar>
+              <w:top w:w="100" w:type="dxa"/>
+              <w:bottom w:w="100" w:type="dxa"/>
+              <w:left w:w="150" w:type="dxa"/>
+              <w:right w:w="150" w:type="dxa"/>
+            </w:tcMar>
+            <w:tcBorders>
+              <w:left w:val="single" w:sz="16" w:color="0284C7"/>
+              <w:top w:val="none"/>
+              <w:bottom w:val="none"/>
+              <w:right w:val="none"/>
+            </w:tcBorders>
+          </w:tcPr>
+          <w:p>
+            <w:pPr>
+              <w:spacing w:line="276" w:lineRule="auto" w:after="40" w:before="40"/>
+            </w:pPr>
+            <w:r>
+              <w:rPr>
+                <w:rFonts w:ascii="Consolas" w:hAnsi="Consolas"/>
+                <w:color w:val="1E293B"/>
+                <w:sz w:val="20"/>
+              </w:rPr>
+              <w:t>$ npm test</w:t>
+              <w:br/>
+            </w:r>
+            <w:r>
+              <w:rPr>
+                <w:rFonts w:ascii="Consolas" w:hAnsi="Consolas"/>
+                <w:color w:val="1E293B"/>
+                <w:sz w:val="20"/>
+              </w:rPr>
+              <w:br/>
+            </w:r>
+            <w:r>
+              <w:rPr>
+                <w:rFonts w:ascii="Consolas" w:hAnsi="Consolas"/>
+                <w:color w:val="1E293B"/>
+                <w:sz w:val="20"/>
+              </w:rPr>
+              <w:t>&gt; yapu@1.0.0 test</w:t>
+              <w:br/>
+            </w:r>
+            <w:r>
+              <w:rPr>
+                <w:rFonts w:ascii="Consolas" w:hAnsi="Consolas"/>
+                <w:color w:val="1E293B"/>
+                <w:sz w:val="20"/>
+              </w:rPr>
+              <w:t>&gt; node --experimental-strip-types --test --test-reporter=spec tests/**/*.test.ts</w:t>
+              <w:br/>
+            </w:r>
+            <w:r>
+              <w:rPr>
+                <w:rFonts w:ascii="Consolas" w:hAnsi="Consolas"/>
+                <w:color w:val="1E293B"/>
+                <w:sz w:val="20"/>
+              </w:rPr>
+              <w:br/>
+            </w:r>
+            <w:r>
+              <w:rPr>
+                <w:rFonts w:ascii="Consolas" w:hAnsi="Consolas"/>
+                <w:color w:val="1E293B"/>
+                <w:sz w:val="20"/>
+              </w:rPr>
+              <w:t>▶ Nivel 1: Pruebas Unitarias - Motor de IA Determinista YAPU</w:t>
+              <w:br/>
+            </w:r>
+            <w:r>
+              <w:rPr>
+                <w:rFonts w:ascii="Consolas" w:hAnsi="Consolas"/>
+                <w:color w:val="1E293B"/>
+                <w:sz w:val="20"/>
+              </w:rPr>
+              <w:t xml:space="preserve">  ▶ Generador de Evaluaciones (generateQuizForLevel)</w:t>
+              <w:br/>
+            </w:r>
+            <w:r>
+              <w:rPr>
+                <w:rFonts w:ascii="Consolas" w:hAnsi="Consolas"/>
+                <w:color w:val="1E293B"/>
+                <w:sz w:val="20"/>
+              </w:rPr>
+              <w:t xml:space="preserve">    ✔ deberia generar exactamente 10 preguntas para el Nivel 1 (1.469ms)</w:t>
+              <w:br/>
+            </w:r>
+            <w:r>
+              <w:rPr>
+                <w:rFonts w:ascii="Consolas" w:hAnsi="Consolas"/>
+                <w:color w:val="1E293B"/>
+                <w:sz w:val="20"/>
+              </w:rPr>
+              <w:t xml:space="preserve">    ✔ cada pregunta debe tener 4 opciones mezcladas y contener la opcion correcta (0.3708ms)</w:t>
+              <w:br/>
+            </w:r>
+            <w:r>
+              <w:rPr>
+                <w:rFonts w:ascii="Consolas" w:hAnsi="Consolas"/>
+                <w:color w:val="1E293B"/>
+                <w:sz w:val="20"/>
+              </w:rPr>
+              <w:t xml:space="preserve">    ✔ los distractores no deben ser identicos a la opcion correcta (0.3311ms)</w:t>
+              <w:br/>
+            </w:r>
+            <w:r>
+              <w:rPr>
+                <w:rFonts w:ascii="Consolas" w:hAnsi="Consolas"/>
+                <w:color w:val="1E293B"/>
+                <w:sz w:val="20"/>
+              </w:rPr>
+              <w:t xml:space="preserve">  ✔ Generador de Evaluaciones (generateQuizForLevel) (2.7761ms)</w:t>
+              <w:br/>
+            </w:r>
+            <w:r>
+              <w:rPr>
+                <w:rFonts w:ascii="Consolas" w:hAnsi="Consolas"/>
+                <w:color w:val="1E293B"/>
+                <w:sz w:val="20"/>
+              </w:rPr>
+              <w:t xml:space="preserve">  ▶ Calificador Determinista (evaluateQuiz)</w:t>
+              <w:br/>
+            </w:r>
+            <w:r>
+              <w:rPr>
+                <w:rFonts w:ascii="Consolas" w:hAnsi="Consolas"/>
+                <w:color w:val="1E293B"/>
+                <w:sz w:val="20"/>
+              </w:rPr>
+              <w:t xml:space="preserve">    ✔ debe aprobar con 100% cuando todas las respuestas son correctas (1.3485ms)</w:t>
+              <w:br/>
+            </w:r>
+            <w:r>
+              <w:rPr>
+                <w:rFonts w:ascii="Consolas" w:hAnsi="Consolas"/>
+                <w:color w:val="1E293B"/>
+                <w:sz w:val="20"/>
+              </w:rPr>
+              <w:t xml:space="preserve">    ✔ debe aprobar en el caso limite exacto del 70% (7 aciertos de 10) (0.1289ms)</w:t>
+              <w:br/>
+            </w:r>
+            <w:r>
+              <w:rPr>
+                <w:rFonts w:ascii="Consolas" w:hAnsi="Consolas"/>
+                <w:color w:val="1E293B"/>
+                <w:sz w:val="20"/>
+              </w:rPr>
+              <w:t xml:space="preserve">    ✔ debe reprobar con 60% (6 aciertos de 10, por debajo del umbral del 70%) (0.1687ms)</w:t>
+              <w:br/>
+            </w:r>
+            <w:r>
+              <w:rPr>
+                <w:rFonts w:ascii="Consolas" w:hAnsi="Consolas"/>
+                <w:color w:val="1E293B"/>
+                <w:sz w:val="20"/>
+              </w:rPr>
+              <w:t xml:space="preserve">    ✔ debe ser tolerante a mayusculas/minusculas y espacios en blanco accidentales (0.1102ms)</w:t>
+              <w:br/>
+            </w:r>
+            <w:r>
+              <w:rPr>
+                <w:rFonts w:ascii="Consolas" w:hAnsi="Consolas"/>
+                <w:color w:val="1E293B"/>
+                <w:sz w:val="20"/>
+              </w:rPr>
+              <w:t xml:space="preserve">  ✔ Calificador Determinista (evaluateQuiz) (2.0376ms)</w:t>
+              <w:br/>
+            </w:r>
+            <w:r>
+              <w:rPr>
+                <w:rFonts w:ascii="Consolas" w:hAnsi="Consolas"/>
+                <w:color w:val="1E293B"/>
+                <w:sz w:val="20"/>
+              </w:rPr>
+              <w:t>✔ Nivel 1: Pruebas Unitarias - Motor de IA Determinista YAPU (5.2422ms)</w:t>
+              <w:br/>
+            </w:r>
+            <w:r>
+              <w:rPr>
+                <w:rFonts w:ascii="Consolas" w:hAnsi="Consolas"/>
+                <w:color w:val="1E293B"/>
+                <w:sz w:val="20"/>
+              </w:rPr>
+              <w:t>▶ Nivel 1: Arquitectura Hexagonal y Principios SOLID</w:t>
+              <w:br/>
+            </w:r>
+            <w:r>
+              <w:rPr>
+                <w:rFonts w:ascii="Consolas" w:hAnsi="Consolas"/>
+                <w:color w:val="1E293B"/>
+                <w:sz w:val="20"/>
+              </w:rPr>
+              <w:t xml:space="preserve">  ▶ Value Objects del Dominio</w:t>
+              <w:br/>
+            </w:r>
+            <w:r>
+              <w:rPr>
+                <w:rFonts w:ascii="Consolas" w:hAnsi="Consolas"/>
+                <w:color w:val="1E293B"/>
+                <w:sz w:val="20"/>
+              </w:rPr>
+              <w:t xml:space="preserve">    ✔ PuntuacionVO: debe validar rango [0, 100] y umbral del 70% (1.4213ms)</w:t>
+              <w:br/>
+            </w:r>
+            <w:r>
+              <w:rPr>
+                <w:rFonts w:ascii="Consolas" w:hAnsi="Consolas"/>
+                <w:color w:val="1E293B"/>
+                <w:sz w:val="20"/>
+              </w:rPr>
+              <w:t xml:space="preserve">    ✔ NivelIdVO: debe restringir niveles estrictamente al rango de 1 a 10 (0.3311ms)</w:t>
+              <w:br/>
+            </w:r>
+            <w:r>
+              <w:rPr>
+                <w:rFonts w:ascii="Consolas" w:hAnsi="Consolas"/>
+                <w:color w:val="1E293B"/>
+                <w:sz w:val="20"/>
+              </w:rPr>
+              <w:t xml:space="preserve">    ✔ TerminoQuechuaVO: debe validar no vacio y normalizar (0.5403ms)</w:t>
+              <w:br/>
+            </w:r>
+            <w:r>
+              <w:rPr>
+                <w:rFonts w:ascii="Consolas" w:hAnsi="Consolas"/>
+                <w:color w:val="1E293B"/>
+                <w:sz w:val="20"/>
+              </w:rPr>
+              <w:t xml:space="preserve">  ✔ Value Objects del Dominio (2.7755ms)</w:t>
+              <w:br/>
+            </w:r>
+            <w:r>
+              <w:rPr>
+                <w:rFonts w:ascii="Consolas" w:hAnsi="Consolas"/>
+                <w:color w:val="1E293B"/>
+                <w:sz w:val="20"/>
+              </w:rPr>
+              <w:t xml:space="preserve">  ▶ Factory Method: EvaluacionFactory</w:t>
+              <w:br/>
+            </w:r>
+            <w:r>
+              <w:rPr>
+                <w:rFonts w:ascii="Consolas" w:hAnsi="Consolas"/>
+                <w:color w:val="1E293B"/>
+                <w:sz w:val="20"/>
+              </w:rPr>
+              <w:t xml:space="preserve">    ✔ debe crear una evaluacion valida con invariantes respetadas (0.8759ms)</w:t>
+              <w:br/>
+            </w:r>
+            <w:r>
+              <w:rPr>
+                <w:rFonts w:ascii="Consolas" w:hAnsi="Consolas"/>
+                <w:color w:val="1E293B"/>
+                <w:sz w:val="20"/>
+              </w:rPr>
+              <w:t xml:space="preserve">    ✔ debe rechazar aciertos negativos o mayores al total de preguntas (0.1433ms)</w:t>
+              <w:br/>
+            </w:r>
+            <w:r>
+              <w:rPr>
+                <w:rFonts w:ascii="Consolas" w:hAnsi="Consolas"/>
+                <w:color w:val="1E293B"/>
+                <w:sz w:val="20"/>
+              </w:rPr>
+              <w:t xml:space="preserve">  ✔ Factory Method: EvaluacionFactory (1.1225ms)</w:t>
+              <w:br/>
+            </w:r>
+            <w:r>
+              <w:rPr>
+                <w:rFonts w:ascii="Consolas" w:hAnsi="Consolas"/>
+                <w:color w:val="1E293B"/>
+                <w:sz w:val="20"/>
+              </w:rPr>
+              <w:t xml:space="preserve">  ▶ Caso de Uso: CalificarEvaluacionUseCase con Inyeccion de Dependencias</w:t>
+              <w:br/>
+            </w:r>
+            <w:r>
+              <w:rPr>
+                <w:rFonts w:ascii="Consolas" w:hAnsi="Consolas"/>
+                <w:color w:val="1E293B"/>
+                <w:sz w:val="20"/>
+              </w:rPr>
+              <w:t xml:space="preserve">    ✔ debe calificar, delegar al repositorio a traves del puerto y retornar el resultado (0.2878ms)</w:t>
+              <w:br/>
+            </w:r>
+            <w:r>
+              <w:rPr>
+                <w:rFonts w:ascii="Consolas" w:hAnsi="Consolas"/>
+                <w:color w:val="1E293B"/>
+                <w:sz w:val="20"/>
+              </w:rPr>
+              <w:t xml:space="preserve">  ✔ Caso de Uso: CalificarEvaluacionUseCase con Inyeccion de Dependencias (0.5802ms)</w:t>
+              <w:br/>
+            </w:r>
+            <w:r>
+              <w:rPr>
+                <w:rFonts w:ascii="Consolas" w:hAnsi="Consolas"/>
+                <w:color w:val="1E293B"/>
+                <w:sz w:val="20"/>
+              </w:rPr>
+              <w:t>✔ Nivel 1: Arquitectura Hexagonal y Principios SOLID (4.9515ms)</w:t>
+              <w:br/>
+            </w:r>
+            <w:r>
+              <w:rPr>
+                <w:rFonts w:ascii="Consolas" w:hAnsi="Consolas"/>
+                <w:color w:val="1E293B"/>
+                <w:sz w:val="20"/>
+              </w:rPr>
+              <w:t>▶ Nivel 1: Pruebas con Mocks y Stubs - LocalRepository (IndexedDB / LocalStorage)</w:t>
+              <w:br/>
+            </w:r>
+            <w:r>
+              <w:rPr>
+                <w:rFonts w:ascii="Consolas" w:hAnsi="Consolas"/>
+                <w:color w:val="1E293B"/>
+                <w:sz w:val="20"/>
+              </w:rPr>
+              <w:t xml:space="preserve">  ✔ debe devolver el perfil por defecto y guardarlo si el almacenamiento esta vacio (0.7606ms)</w:t>
+              <w:br/>
+            </w:r>
+            <w:r>
+              <w:rPr>
+                <w:rFonts w:ascii="Consolas" w:hAnsi="Consolas"/>
+                <w:color w:val="1E293B"/>
+                <w:sz w:val="20"/>
+              </w:rPr>
+              <w:t xml:space="preserve">  ✔ debe desbloquear el nivel siguiente y sumar 100 puntos de experiencia (0.1943ms)</w:t>
+              <w:br/>
+            </w:r>
+            <w:r>
+              <w:rPr>
+                <w:rFonts w:ascii="Consolas" w:hAnsi="Consolas"/>
+                <w:color w:val="1E293B"/>
+                <w:sz w:val="20"/>
+              </w:rPr>
+              <w:t xml:space="preserve">  ✔ no debe permitir desbloquear niveles superiores al maximo permitido (nivel 10) (0.1865ms)</w:t>
+              <w:br/>
+            </w:r>
+            <w:r>
+              <w:rPr>
+                <w:rFonts w:ascii="Consolas" w:hAnsi="Consolas"/>
+                <w:color w:val="1E293B"/>
+                <w:sz w:val="20"/>
+              </w:rPr>
+              <w:t xml:space="preserve">  ✔ debe marcar una palabra como aprendida e incrementar el contador de aciertos (0.2936ms)</w:t>
+              <w:br/>
+            </w:r>
+            <w:r>
+              <w:rPr>
+                <w:rFonts w:ascii="Consolas" w:hAnsi="Consolas"/>
+                <w:color w:val="1E293B"/>
+                <w:sz w:val="20"/>
+              </w:rPr>
+              <w:t xml:space="preserve">  ✔ debe almacenar una evaluacion y encolarla en la cola de sincronizacion offline cuando no hay red (0.501ms)</w:t>
+              <w:br/>
+            </w:r>
+            <w:r>
+              <w:rPr>
+                <w:rFonts w:ascii="Consolas" w:hAnsi="Consolas"/>
+                <w:color w:val="1E293B"/>
+                <w:sz w:val="20"/>
+              </w:rPr>
+              <w:t>✔ Nivel 1: Pruebas con Mocks y Stubs - LocalRepository (IndexedDB / LocalStorage) (2.784ms)</w:t>
+              <w:br/>
+            </w:r>
+            <w:r>
+              <w:rPr>
+                <w:rFonts w:ascii="Consolas" w:hAnsi="Consolas"/>
+                <w:color w:val="1E293B"/>
+                <w:sz w:val="20"/>
+              </w:rPr>
+              <w:t>ℹ tests 18</w:t>
+              <w:br/>
+            </w:r>
+            <w:r>
+              <w:rPr>
+                <w:rFonts w:ascii="Consolas" w:hAnsi="Consolas"/>
+                <w:color w:val="1E293B"/>
+                <w:sz w:val="20"/>
+              </w:rPr>
+              <w:t>ℹ suites 8</w:t>
+              <w:br/>
+            </w:r>
+            <w:r>
+              <w:rPr>
+                <w:rFonts w:ascii="Consolas" w:hAnsi="Consolas"/>
+                <w:color w:val="1E293B"/>
+                <w:sz w:val="20"/>
+              </w:rPr>
+              <w:t>ℹ pass 18</w:t>
+              <w:br/>
+            </w:r>
+            <w:r>
+              <w:rPr>
+                <w:rFonts w:ascii="Consolas" w:hAnsi="Consolas"/>
+                <w:color w:val="1E293B"/>
+                <w:sz w:val="20"/>
+              </w:rPr>
+              <w:t>ℹ fail 0</w:t>
+              <w:br/>
+            </w:r>
+            <w:r>
+              <w:rPr>
+                <w:rFonts w:ascii="Consolas" w:hAnsi="Consolas"/>
+                <w:color w:val="1E293B"/>
+                <w:sz w:val="20"/>
+              </w:rPr>
+              <w:t>ℹ cancelled 0</w:t>
+              <w:br/>
+            </w:r>
+            <w:r>
+              <w:rPr>
+                <w:rFonts w:ascii="Consolas" w:hAnsi="Consolas"/>
+                <w:color w:val="1E293B"/>
+                <w:sz w:val="20"/>
+              </w:rPr>
+              <w:t>ℹ skipped 0</w:t>
+              <w:br/>
+            </w:r>
+            <w:r>
+              <w:rPr>
+                <w:rFonts w:ascii="Consolas" w:hAnsi="Consolas"/>
+                <w:color w:val="1E293B"/>
+                <w:sz w:val="20"/>
+              </w:rPr>
+              <w:t>ℹ todo 0</w:t>
+              <w:br/>
+            </w:r>
+            <w:r>
+              <w:rPr>
+                <w:rFonts w:ascii="Consolas" w:hAnsi="Consolas"/>
+                <w:color w:val="1E293B"/>
+                <w:sz w:val="20"/>
+              </w:rPr>
+              <w:t>ℹ duration_ms 122.4293</w:t>
+            </w:r>
+          </w:p>
+        </w:tc>
+      </w:tr>
+    </w:tbl>
+    <w:p>
+      <w:pPr>
         <w:spacing w:before="280" w:after="120" w:line="360" w:lineRule="auto"/>
         <w:jc w:val="left"/>
       </w:pPr>
@@ -9881,6 +10394,205 @@
         <w:t xml:space="preserve"> Proteccion contra sobreescritura del historial.</w:t>
       </w:r>
     </w:p>
+    <w:p>
+      <w:pPr>
+        <w:spacing w:before="200" w:after="80" w:line="360" w:lineRule="auto"/>
+        <w:jc w:val="left"/>
+      </w:pPr>
+      <w:r>
+        <w:rPr>
+          <w:rFonts w:ascii="Times New Roman" w:hAnsi="Times New Roman"/>
+          <w:b/>
+          <w:i/>
+          <w:color w:val="334155"/>
+          <w:sz w:val="24"/>
+        </w:rPr>
+        <w:t>11.5 Evidencia de Versionado Git y Trazabilidad de Commits (Captura de Consola)</w:t>
+      </w:r>
+    </w:p>
+    <w:p>
+      <w:pPr>
+        <w:spacing w:line="360" w:lineRule="auto" w:after="80" w:before="0"/>
+      </w:pPr>
+      <w:r>
+        <w:rPr>
+          <w:rFonts w:ascii="Times New Roman" w:hAnsi="Times New Roman"/>
+          <w:sz w:val="24"/>
+        </w:rPr>
+        <w:t xml:space="preserve">A continuacion se presenta la captura textual del arbol de commits verificado mediante </w:t>
+      </w:r>
+      <w:r>
+        <w:rPr>
+          <w:rFonts w:ascii="Consolas" w:hAnsi="Consolas"/>
+          <w:color w:val="C2410C"/>
+          <w:sz w:val="21"/>
+        </w:rPr>
+        <w:t>git log --graph --oneline</w:t>
+      </w:r>
+      <w:r>
+        <w:rPr>
+          <w:rFonts w:ascii="Times New Roman" w:hAnsi="Times New Roman"/>
+          <w:sz w:val="24"/>
+        </w:rPr>
+        <w:t xml:space="preserve"> y el estado limpio del repositorio mediante </w:t>
+      </w:r>
+      <w:r>
+        <w:rPr>
+          <w:rFonts w:ascii="Consolas" w:hAnsi="Consolas"/>
+          <w:color w:val="C2410C"/>
+          <w:sz w:val="21"/>
+        </w:rPr>
+        <w:t>git status</w:t>
+      </w:r>
+      <w:r>
+        <w:rPr>
+          <w:rFonts w:ascii="Times New Roman" w:hAnsi="Times New Roman"/>
+          <w:sz w:val="24"/>
+        </w:rPr>
+        <w:t>:</w:t>
+      </w:r>
+    </w:p>
+    <w:tbl>
+      <w:tblPr>
+        <w:tblW w:type="auto" w:w="0"/>
+        <w:jc w:val="center"/>
+        <w:tblLook w:firstColumn="1" w:firstRow="1" w:lastColumn="0" w:lastRow="0" w:noHBand="0" w:noVBand="1" w:val="04A0"/>
+      </w:tblPr>
+      <w:tblGrid>
+        <w:gridCol w:w="9360"/>
+      </w:tblGrid>
+      <w:tr>
+        <w:tc>
+          <w:tcPr>
+            <w:tcW w:type="dxa" w:w="9360"/>
+            <w:shd w:fill="F8FAFC"/>
+            <w:tcMar>
+              <w:top w:w="100" w:type="dxa"/>
+              <w:bottom w:w="100" w:type="dxa"/>
+              <w:left w:w="150" w:type="dxa"/>
+              <w:right w:w="150" w:type="dxa"/>
+            </w:tcMar>
+            <w:tcBorders>
+              <w:left w:val="single" w:sz="16" w:color="0284C7"/>
+              <w:top w:val="none"/>
+              <w:bottom w:val="none"/>
+              <w:right w:val="none"/>
+            </w:tcBorders>
+          </w:tcPr>
+          <w:p>
+            <w:pPr>
+              <w:spacing w:line="276" w:lineRule="auto" w:after="40" w:before="40"/>
+            </w:pPr>
+            <w:r>
+              <w:rPr>
+                <w:rFonts w:ascii="Consolas" w:hAnsi="Consolas"/>
+                <w:color w:val="1E293B"/>
+                <w:sz w:val="20"/>
+              </w:rPr>
+              <w:t>$ git log --graph --oneline -n 6</w:t>
+              <w:br/>
+            </w:r>
+            <w:r>
+              <w:rPr>
+                <w:rFonts w:ascii="Consolas" w:hAnsi="Consolas"/>
+                <w:color w:val="1E293B"/>
+                <w:sz w:val="20"/>
+              </w:rPr>
+              <w:t>* 2734999 feat(tarea-04): entrega final de gestion gobernanza y riesgos, arquitectura hexagonal, pruebas unitarias y ci-cd</w:t>
+              <w:br/>
+            </w:r>
+            <w:r>
+              <w:rPr>
+                <w:rFonts w:ascii="Consolas" w:hAnsi="Consolas"/>
+                <w:color w:val="1E293B"/>
+                <w:sz w:val="20"/>
+              </w:rPr>
+              <w:t>* 7480691 docs(actividad-03): album UML APA 7 actualizado con diagramas del mapa, presentacion PowerPoint y guion de defensa</w:t>
+              <w:br/>
+            </w:r>
+            <w:r>
+              <w:rPr>
+                <w:rFonts w:ascii="Consolas" w:hAnsi="Consolas"/>
+                <w:color w:val="1E293B"/>
+                <w:sz w:val="20"/>
+              </w:rPr>
+              <w:t>* 63bc2db docs: compendio humanizado de investigacion tecnica y laboratorio Java en tareas-varias.md</w:t>
+              <w:br/>
+            </w:r>
+            <w:r>
+              <w:rPr>
+                <w:rFonts w:ascii="Consolas" w:hAnsi="Consolas"/>
+                <w:color w:val="1E293B"/>
+                <w:sz w:val="20"/>
+              </w:rPr>
+              <w:t>* 0ceff5a docs(actividad-03): corregir caratula UPDS Santa Cruz, docente Ing. Requena, integrantes Jhoel y Emmanuel, e integrar matriz de auditoria de IA completa</w:t>
+              <w:br/>
+            </w:r>
+            <w:r>
+              <w:rPr>
+                <w:rFonts w:ascii="Consolas" w:hAnsi="Consolas"/>
+                <w:color w:val="1E293B"/>
+                <w:sz w:val="20"/>
+              </w:rPr>
+              <w:t>* 67e3680 docs(actividad-03): album de modelos UML IEEE 1016, informe APA 7, presentacion y guion de defensa</w:t>
+              <w:br/>
+            </w:r>
+            <w:r>
+              <w:rPr>
+                <w:rFonts w:ascii="Consolas" w:hAnsi="Consolas"/>
+                <w:color w:val="1E293B"/>
+                <w:sz w:val="20"/>
+              </w:rPr>
+              <w:t>* fe0fe1a docs: agregar README.md completo con arquitectura, puertos 9500+, motor IA y guia de despliegue</w:t>
+              <w:br/>
+            </w:r>
+            <w:r>
+              <w:rPr>
+                <w:rFonts w:ascii="Consolas" w:hAnsi="Consolas"/>
+                <w:color w:val="1E293B"/>
+                <w:sz w:val="20"/>
+              </w:rPr>
+              <w:br/>
+            </w:r>
+            <w:r>
+              <w:rPr>
+                <w:rFonts w:ascii="Consolas" w:hAnsi="Consolas"/>
+                <w:color w:val="1E293B"/>
+                <w:sz w:val="20"/>
+              </w:rPr>
+              <w:t>$ git status</w:t>
+              <w:br/>
+            </w:r>
+            <w:r>
+              <w:rPr>
+                <w:rFonts w:ascii="Consolas" w:hAnsi="Consolas"/>
+                <w:color w:val="1E293B"/>
+                <w:sz w:val="20"/>
+              </w:rPr>
+              <w:t>On branch main</w:t>
+              <w:br/>
+            </w:r>
+            <w:r>
+              <w:rPr>
+                <w:rFonts w:ascii="Consolas" w:hAnsi="Consolas"/>
+                <w:color w:val="1E293B"/>
+                <w:sz w:val="20"/>
+              </w:rPr>
+              <w:t>Your branch is up to date with 'origin/main'.</w:t>
+              <w:br/>
+            </w:r>
+            <w:r>
+              <w:rPr>
+                <w:rFonts w:ascii="Consolas" w:hAnsi="Consolas"/>
+                <w:color w:val="1E293B"/>
+                <w:sz w:val="20"/>
+              </w:rPr>
+              <w:t>nothing to commit, working tree clean</w:t>
+            </w:r>
+          </w:p>
+        </w:tc>
+      </w:tr>
+    </w:tbl>
     <w:p>
       <w:pPr>
         <w:spacing w:before="280" w:after="120" w:line="360" w:lineRule="auto"/>

</xml_diff>

<commit_message>
docs(tarea-04): actualizar capitulo 10 con evidencias reales de testing y compilar docx y pdf
</commit_message>
<xml_diff>
--- a/Docs/Informe_Tarea04_Gestion_Gobernanza_Riesgos.docx
+++ b/Docs/Informe_Tarea04_Gestion_Gobernanza_Riesgos.docx
@@ -8315,7 +8315,7 @@
           <w:rFonts w:ascii="Times New Roman" w:hAnsi="Times New Roman"/>
           <w:sz w:val="24"/>
         </w:rPr>
-        <w:t>, YAPU implementa la piramide de testing completa:</w:t>
+        <w:t>, YAPU implementa la piramide de testing completa, combinando verificacion estatica, pruebas unitarias aisladas, pruebas de regresion y pruebas de pantalla End-to-End sobre navegadores reales:</w:t>
       </w:r>
     </w:p>
     <w:tbl>
@@ -8382,7 +8382,7 @@
                 <w:color w:val="1E293B"/>
                 <w:sz w:val="20"/>
               </w:rPr>
-              <w:t xml:space="preserve">           /-------\    Nivel 3: Sistema y Regresion (E2E, verificacion build)</w:t>
+              <w:t xml:space="preserve">           /-------\    Nivel 3: E2E Playwright y Regresion (Pantalla y flujos)</w:t>
               <w:br/>
             </w:r>
             <w:r>
@@ -8400,7 +8400,7 @@
                 <w:color w:val="1E293B"/>
                 <w:sz w:val="20"/>
               </w:rPr>
-              <w:t xml:space="preserve">         /-----------\  Nivel 2: Integracion (Persistencia y APIs)</w:t>
+              <w:t xml:space="preserve">         / Integracion \ Nivel 2: Integracion (Persistencia y Sincronizacion)</w:t>
               <w:br/>
             </w:r>
             <w:r>
@@ -8409,7 +8409,7 @@
                 <w:color w:val="1E293B"/>
                 <w:sz w:val="20"/>
               </w:rPr>
-              <w:t xml:space="preserve">        / Integracion \ --------------------------------------------------</w:t>
+              <w:t xml:space="preserve">        /---------------\ --------------------------------------------------</w:t>
               <w:br/>
             </w:r>
             <w:r>
@@ -8418,7 +8418,7 @@
                 <w:color w:val="1E293B"/>
                 <w:sz w:val="20"/>
               </w:rPr>
-              <w:t xml:space="preserve">       /---------------\ Nivel 1: Pruebas Unitarias (Rapidas, aisladas con mocks)</w:t>
+              <w:t xml:space="preserve">       /    Unitarias    \ Nivel 1: Pruebas Unitarias (Vitest + Dominio Hexagonal)</w:t>
               <w:br/>
             </w:r>
             <w:r>
@@ -8427,7 +8427,1272 @@
                 <w:color w:val="1E293B"/>
                 <w:sz w:val="20"/>
               </w:rPr>
-              <w:t xml:space="preserve">      /    Unitarias    \</w:t>
+              <w:t xml:space="preserve">      ---------------------</w:t>
+            </w:r>
+          </w:p>
+        </w:tc>
+      </w:tr>
+    </w:tbl>
+    <w:p>
+      <w:pPr>
+        <w:spacing w:before="200" w:after="80" w:line="360" w:lineRule="auto"/>
+        <w:jc w:val="left"/>
+      </w:pPr>
+      <w:r>
+        <w:rPr>
+          <w:rFonts w:ascii="Times New Roman" w:hAnsi="Times New Roman"/>
+          <w:b/>
+          <w:i/>
+          <w:color w:val="334155"/>
+          <w:sz w:val="24"/>
+        </w:rPr>
+        <w:t>10.1 Nivel 1: Pruebas Unitarias (Vitest, aisladas con Value Objects y Mocks)</w:t>
+      </w:r>
+    </w:p>
+    <w:p>
+      <w:pPr>
+        <w:spacing w:line="360" w:lineRule="auto" w:after="80" w:before="0"/>
+        <w:ind w:left="360"/>
+      </w:pPr>
+      <w:r>
+        <w:rPr>
+          <w:rFonts w:ascii="Times New Roman" w:hAnsi="Times New Roman"/>
+          <w:b/>
+          <w:sz w:val="24"/>
+        </w:rPr>
+        <w:t xml:space="preserve">• </w:t>
+      </w:r>
+      <w:r>
+        <w:rPr>
+          <w:rFonts w:ascii="Times New Roman" w:hAnsi="Times New Roman"/>
+          <w:b/>
+          <w:sz w:val="24"/>
+        </w:rPr>
+        <w:t>Herramienta:</w:t>
+      </w:r>
+      <w:r>
+        <w:rPr>
+          <w:rFonts w:ascii="Times New Roman" w:hAnsi="Times New Roman"/>
+          <w:sz w:val="24"/>
+        </w:rPr>
+        <w:t xml:space="preserve"> Vitest 5.0 con TypeScript estricto y JSDOM.</w:t>
+      </w:r>
+    </w:p>
+    <w:p>
+      <w:pPr>
+        <w:spacing w:line="360" w:lineRule="auto" w:after="80" w:before="0"/>
+        <w:ind w:left="360"/>
+      </w:pPr>
+      <w:r>
+        <w:rPr>
+          <w:rFonts w:ascii="Times New Roman" w:hAnsi="Times New Roman"/>
+          <w:b/>
+          <w:sz w:val="24"/>
+        </w:rPr>
+        <w:t xml:space="preserve">• </w:t>
+      </w:r>
+      <w:r>
+        <w:rPr>
+          <w:rFonts w:ascii="Times New Roman" w:hAnsi="Times New Roman"/>
+          <w:b/>
+          <w:sz w:val="24"/>
+        </w:rPr>
+        <w:t>Caracteristicas:</w:t>
+      </w:r>
+      <w:r>
+        <w:rPr>
+          <w:rFonts w:ascii="Times New Roman" w:hAnsi="Times New Roman"/>
+          <w:sz w:val="24"/>
+        </w:rPr>
+        <w:t xml:space="preserve"> Ejecucion ultra-rapida (menos de 1 segundo para 18 pruebas), aislamiento total del modelo de dominio hexagonal y desacoplamiento de almacenamiento.</w:t>
+      </w:r>
+    </w:p>
+    <w:p>
+      <w:pPr>
+        <w:spacing w:line="360" w:lineRule="auto" w:after="80" w:before="0"/>
+        <w:ind w:left="360"/>
+      </w:pPr>
+      <w:r>
+        <w:rPr>
+          <w:rFonts w:ascii="Times New Roman" w:hAnsi="Times New Roman"/>
+          <w:b/>
+          <w:sz w:val="24"/>
+        </w:rPr>
+        <w:t xml:space="preserve">• </w:t>
+      </w:r>
+      <w:r>
+        <w:rPr>
+          <w:rFonts w:ascii="Times New Roman" w:hAnsi="Times New Roman"/>
+          <w:b/>
+          <w:sz w:val="24"/>
+        </w:rPr>
+        <w:t>Casos Ejecutados en el Repositorio (`tests/unit/`):</w:t>
+      </w:r>
+    </w:p>
+    <w:p>
+      <w:pPr>
+        <w:spacing w:line="360" w:lineRule="auto" w:after="80" w:before="0"/>
+      </w:pPr>
+      <w:r>
+        <w:rPr>
+          <w:rFonts w:ascii="Times New Roman" w:hAnsi="Times New Roman"/>
+          <w:sz w:val="24"/>
+        </w:rPr>
+        <w:t xml:space="preserve">  * </w:t>
+      </w:r>
+      <w:r>
+        <w:rPr>
+          <w:rFonts w:ascii="Consolas" w:hAnsi="Consolas"/>
+          <w:color w:val="C2410C"/>
+          <w:sz w:val="21"/>
+        </w:rPr>
+        <w:t>UT-01</w:t>
+      </w:r>
+      <w:r>
+        <w:rPr>
+          <w:rFonts w:ascii="Times New Roman" w:hAnsi="Times New Roman"/>
+          <w:sz w:val="24"/>
+        </w:rPr>
+        <w:t xml:space="preserve">: Validacion de limites de </w:t>
+      </w:r>
+      <w:r>
+        <w:rPr>
+          <w:rFonts w:ascii="Consolas" w:hAnsi="Consolas"/>
+          <w:color w:val="C2410C"/>
+          <w:sz w:val="21"/>
+        </w:rPr>
+        <w:t>PuntuacionVO</w:t>
+      </w:r>
+      <w:r>
+        <w:rPr>
+          <w:rFonts w:ascii="Times New Roman" w:hAnsi="Times New Roman"/>
+          <w:sz w:val="24"/>
+        </w:rPr>
+        <w:t xml:space="preserve"> (rango 0 a 100, rechazo de negativos y decimales).</w:t>
+      </w:r>
+    </w:p>
+    <w:p>
+      <w:pPr>
+        <w:spacing w:line="360" w:lineRule="auto" w:after="80" w:before="0"/>
+      </w:pPr>
+      <w:r>
+        <w:rPr>
+          <w:rFonts w:ascii="Times New Roman" w:hAnsi="Times New Roman"/>
+          <w:sz w:val="24"/>
+        </w:rPr>
+        <w:t xml:space="preserve">  * </w:t>
+      </w:r>
+      <w:r>
+        <w:rPr>
+          <w:rFonts w:ascii="Consolas" w:hAnsi="Consolas"/>
+          <w:color w:val="C2410C"/>
+          <w:sz w:val="21"/>
+        </w:rPr>
+        <w:t>UT-02</w:t>
+      </w:r>
+      <w:r>
+        <w:rPr>
+          <w:rFonts w:ascii="Times New Roman" w:hAnsi="Times New Roman"/>
+          <w:sz w:val="24"/>
+        </w:rPr>
+        <w:t xml:space="preserve">: Validacion del umbral de aprobacion de </w:t>
+      </w:r>
+      <w:r>
+        <w:rPr>
+          <w:rFonts w:ascii="Consolas" w:hAnsi="Consolas"/>
+          <w:color w:val="C2410C"/>
+          <w:sz w:val="21"/>
+        </w:rPr>
+        <w:t>PuntuacionVO</w:t>
+      </w:r>
+      <w:r>
+        <w:rPr>
+          <w:rFonts w:ascii="Times New Roman" w:hAnsi="Times New Roman"/>
+          <w:sz w:val="24"/>
+        </w:rPr>
+        <w:t xml:space="preserve"> (caso 70% aprueba, caso 69% reprueba).</w:t>
+      </w:r>
+    </w:p>
+    <w:p>
+      <w:pPr>
+        <w:spacing w:line="360" w:lineRule="auto" w:after="80" w:before="0"/>
+      </w:pPr>
+      <w:r>
+        <w:rPr>
+          <w:rFonts w:ascii="Times New Roman" w:hAnsi="Times New Roman"/>
+          <w:sz w:val="24"/>
+        </w:rPr>
+        <w:t xml:space="preserve">  * </w:t>
+      </w:r>
+      <w:r>
+        <w:rPr>
+          <w:rFonts w:ascii="Consolas" w:hAnsi="Consolas"/>
+          <w:color w:val="C2410C"/>
+          <w:sz w:val="21"/>
+        </w:rPr>
+        <w:t>UT-03</w:t>
+      </w:r>
+      <w:r>
+        <w:rPr>
+          <w:rFonts w:ascii="Times New Roman" w:hAnsi="Times New Roman"/>
+          <w:sz w:val="24"/>
+        </w:rPr>
+        <w:t xml:space="preserve">: Restriccion de </w:t>
+      </w:r>
+      <w:r>
+        <w:rPr>
+          <w:rFonts w:ascii="Consolas" w:hAnsi="Consolas"/>
+          <w:color w:val="C2410C"/>
+          <w:sz w:val="21"/>
+        </w:rPr>
+        <w:t>NivelIdVO</w:t>
+      </w:r>
+      <w:r>
+        <w:rPr>
+          <w:rFonts w:ascii="Times New Roman" w:hAnsi="Times New Roman"/>
+          <w:sz w:val="24"/>
+        </w:rPr>
+        <w:t xml:space="preserve"> (solo enteros de 1 a 10, excepcion al superar 10).</w:t>
+      </w:r>
+    </w:p>
+    <w:p>
+      <w:pPr>
+        <w:spacing w:line="360" w:lineRule="auto" w:after="80" w:before="0"/>
+      </w:pPr>
+      <w:r>
+        <w:rPr>
+          <w:rFonts w:ascii="Times New Roman" w:hAnsi="Times New Roman"/>
+          <w:sz w:val="24"/>
+        </w:rPr>
+        <w:t xml:space="preserve">  * </w:t>
+      </w:r>
+      <w:r>
+        <w:rPr>
+          <w:rFonts w:ascii="Consolas" w:hAnsi="Consolas"/>
+          <w:color w:val="C2410C"/>
+          <w:sz w:val="21"/>
+        </w:rPr>
+        <w:t>UT-04</w:t>
+      </w:r>
+      <w:r>
+        <w:rPr>
+          <w:rFonts w:ascii="Times New Roman" w:hAnsi="Times New Roman"/>
+          <w:sz w:val="24"/>
+        </w:rPr>
+        <w:t xml:space="preserve">: Normalizacion y validacion no-vacia de </w:t>
+      </w:r>
+      <w:r>
+        <w:rPr>
+          <w:rFonts w:ascii="Consolas" w:hAnsi="Consolas"/>
+          <w:color w:val="C2410C"/>
+          <w:sz w:val="21"/>
+        </w:rPr>
+        <w:t>TerminoQuechuaVO</w:t>
+      </w:r>
+      <w:r>
+        <w:rPr>
+          <w:rFonts w:ascii="Times New Roman" w:hAnsi="Times New Roman"/>
+          <w:sz w:val="24"/>
+        </w:rPr>
+        <w:t>.</w:t>
+      </w:r>
+    </w:p>
+    <w:p>
+      <w:pPr>
+        <w:spacing w:line="360" w:lineRule="auto" w:after="80" w:before="0"/>
+      </w:pPr>
+      <w:r>
+        <w:rPr>
+          <w:rFonts w:ascii="Times New Roman" w:hAnsi="Times New Roman"/>
+          <w:sz w:val="24"/>
+        </w:rPr>
+        <w:t xml:space="preserve">  * </w:t>
+      </w:r>
+      <w:r>
+        <w:rPr>
+          <w:rFonts w:ascii="Consolas" w:hAnsi="Consolas"/>
+          <w:color w:val="C2410C"/>
+          <w:sz w:val="21"/>
+        </w:rPr>
+        <w:t>UT-05</w:t>
+      </w:r>
+      <w:r>
+        <w:rPr>
+          <w:rFonts w:ascii="Times New Roman" w:hAnsi="Times New Roman"/>
+          <w:sz w:val="24"/>
+        </w:rPr>
+        <w:t xml:space="preserve">: Creacion valida de </w:t>
+      </w:r>
+      <w:r>
+        <w:rPr>
+          <w:rFonts w:ascii="Consolas" w:hAnsi="Consolas"/>
+          <w:color w:val="C2410C"/>
+          <w:sz w:val="21"/>
+        </w:rPr>
+        <w:t>EvaluacionFactory</w:t>
+      </w:r>
+      <w:r>
+        <w:rPr>
+          <w:rFonts w:ascii="Times New Roman" w:hAnsi="Times New Roman"/>
+          <w:sz w:val="24"/>
+        </w:rPr>
+        <w:t xml:space="preserve"> e invariantes de fecha y estado.</w:t>
+      </w:r>
+    </w:p>
+    <w:p>
+      <w:pPr>
+        <w:spacing w:line="360" w:lineRule="auto" w:after="80" w:before="0"/>
+      </w:pPr>
+      <w:r>
+        <w:rPr>
+          <w:rFonts w:ascii="Times New Roman" w:hAnsi="Times New Roman"/>
+          <w:sz w:val="24"/>
+        </w:rPr>
+        <w:t xml:space="preserve">  * </w:t>
+      </w:r>
+      <w:r>
+        <w:rPr>
+          <w:rFonts w:ascii="Consolas" w:hAnsi="Consolas"/>
+          <w:color w:val="C2410C"/>
+          <w:sz w:val="21"/>
+        </w:rPr>
+        <w:t>UT-06</w:t>
+      </w:r>
+      <w:r>
+        <w:rPr>
+          <w:rFonts w:ascii="Times New Roman" w:hAnsi="Times New Roman"/>
+          <w:sz w:val="24"/>
+        </w:rPr>
+        <w:t xml:space="preserve">: Inyeccion de dependencias en </w:t>
+      </w:r>
+      <w:r>
+        <w:rPr>
+          <w:rFonts w:ascii="Consolas" w:hAnsi="Consolas"/>
+          <w:color w:val="C2410C"/>
+          <w:sz w:val="21"/>
+        </w:rPr>
+        <w:t>CalificarEvaluacionUseCase</w:t>
+      </w:r>
+      <w:r>
+        <w:rPr>
+          <w:rFonts w:ascii="Times New Roman" w:hAnsi="Times New Roman"/>
+          <w:sz w:val="24"/>
+        </w:rPr>
+        <w:t xml:space="preserve"> utilizando un Mock Repository a traves de su interfaz puerto.</w:t>
+      </w:r>
+    </w:p>
+    <w:p>
+      <w:pPr>
+        <w:spacing w:line="360" w:lineRule="auto" w:after="80" w:before="0"/>
+      </w:pPr>
+      <w:r>
+        <w:rPr>
+          <w:rFonts w:ascii="Times New Roman" w:hAnsi="Times New Roman"/>
+          <w:sz w:val="24"/>
+        </w:rPr>
+        <w:t xml:space="preserve">  * </w:t>
+      </w:r>
+      <w:r>
+        <w:rPr>
+          <w:rFonts w:ascii="Consolas" w:hAnsi="Consolas"/>
+          <w:color w:val="C2410C"/>
+          <w:sz w:val="21"/>
+        </w:rPr>
+        <w:t>UT-07</w:t>
+      </w:r>
+      <w:r>
+        <w:rPr>
+          <w:rFonts w:ascii="Times New Roman" w:hAnsi="Times New Roman"/>
+          <w:sz w:val="24"/>
+        </w:rPr>
+        <w:t>: Generacion determinista de 10 preguntas por nivel con 4 opciones mezcladas y sin colisiones de distractores.</w:t>
+      </w:r>
+    </w:p>
+    <w:p>
+      <w:pPr>
+        <w:spacing w:line="360" w:lineRule="auto" w:after="80" w:before="0"/>
+      </w:pPr>
+      <w:r>
+        <w:rPr>
+          <w:rFonts w:ascii="Times New Roman" w:hAnsi="Times New Roman"/>
+          <w:sz w:val="24"/>
+        </w:rPr>
+        <w:t xml:space="preserve">  * </w:t>
+      </w:r>
+      <w:r>
+        <w:rPr>
+          <w:rFonts w:ascii="Consolas" w:hAnsi="Consolas"/>
+          <w:color w:val="C2410C"/>
+          <w:sz w:val="21"/>
+        </w:rPr>
+        <w:t>UT-08</w:t>
+      </w:r>
+      <w:r>
+        <w:rPr>
+          <w:rFonts w:ascii="Times New Roman" w:hAnsi="Times New Roman"/>
+          <w:sz w:val="24"/>
+        </w:rPr>
+        <w:t>: Doble de prueba (Mock de LocalStorage) para verificar llamadas y persistencia sin red ni base de datos externa.</w:t>
+      </w:r>
+    </w:p>
+    <w:p>
+      <w:pPr>
+        <w:spacing w:line="360" w:lineRule="auto" w:after="80" w:before="0"/>
+      </w:pPr>
+      <w:r>
+        <w:rPr>
+          <w:rFonts w:ascii="Times New Roman" w:hAnsi="Times New Roman"/>
+          <w:sz w:val="24"/>
+        </w:rPr>
+        <w:t xml:space="preserve">  * </w:t>
+      </w:r>
+      <w:r>
+        <w:rPr>
+          <w:rFonts w:ascii="Consolas" w:hAnsi="Consolas"/>
+          <w:color w:val="C2410C"/>
+          <w:sz w:val="21"/>
+        </w:rPr>
+        <w:t>UT-09</w:t>
+      </w:r>
+      <w:r>
+        <w:rPr>
+          <w:rFonts w:ascii="Times New Roman" w:hAnsi="Times New Roman"/>
+          <w:sz w:val="24"/>
+        </w:rPr>
+        <w:t xml:space="preserve">: Encolado en cola offline cuando </w:t>
+      </w:r>
+      <w:r>
+        <w:rPr>
+          <w:rFonts w:ascii="Consolas" w:hAnsi="Consolas"/>
+          <w:color w:val="C2410C"/>
+          <w:sz w:val="21"/>
+        </w:rPr>
+        <w:t>navigator.onLine</w:t>
+      </w:r>
+      <w:r>
+        <w:rPr>
+          <w:rFonts w:ascii="Times New Roman" w:hAnsi="Times New Roman"/>
+          <w:sz w:val="24"/>
+        </w:rPr>
+        <w:t xml:space="preserve"> es falso.</w:t>
+      </w:r>
+    </w:p>
+    <w:p>
+      <w:pPr>
+        <w:spacing w:before="200" w:after="80" w:line="360" w:lineRule="auto"/>
+        <w:jc w:val="left"/>
+      </w:pPr>
+      <w:r>
+        <w:rPr>
+          <w:rFonts w:ascii="Times New Roman" w:hAnsi="Times New Roman"/>
+          <w:b/>
+          <w:i/>
+          <w:color w:val="334155"/>
+          <w:sz w:val="24"/>
+        </w:rPr>
+        <w:t>10.2 Nivel 2 y 3: Pruebas de Regresion de Flujos Criticos (`tests/regression/`)</w:t>
+      </w:r>
+    </w:p>
+    <w:p>
+      <w:pPr>
+        <w:spacing w:line="360" w:lineRule="auto" w:after="80" w:before="0"/>
+        <w:ind w:left="360"/>
+      </w:pPr>
+      <w:r>
+        <w:rPr>
+          <w:rFonts w:ascii="Times New Roman" w:hAnsi="Times New Roman"/>
+          <w:b/>
+          <w:sz w:val="24"/>
+        </w:rPr>
+        <w:t xml:space="preserve">• </w:t>
+      </w:r>
+      <w:r>
+        <w:rPr>
+          <w:rFonts w:ascii="Times New Roman" w:hAnsi="Times New Roman"/>
+          <w:b/>
+          <w:sz w:val="24"/>
+        </w:rPr>
+        <w:t>Foco:</w:t>
+      </w:r>
+      <w:r>
+        <w:rPr>
+          <w:rFonts w:ascii="Times New Roman" w:hAnsi="Times New Roman"/>
+          <w:sz w:val="24"/>
+        </w:rPr>
+        <w:t xml:space="preserve"> Asegurar que ninguna modificacion estructural afecte las reglas de negocio criticas ni corrompa el progreso del usuario.</w:t>
+      </w:r>
+    </w:p>
+    <w:p>
+      <w:pPr>
+        <w:spacing w:line="360" w:lineRule="auto" w:after="80" w:before="0"/>
+        <w:ind w:left="360"/>
+      </w:pPr>
+      <w:r>
+        <w:rPr>
+          <w:rFonts w:ascii="Times New Roman" w:hAnsi="Times New Roman"/>
+          <w:b/>
+          <w:sz w:val="24"/>
+        </w:rPr>
+        <w:t xml:space="preserve">• </w:t>
+      </w:r>
+      <w:r>
+        <w:rPr>
+          <w:rFonts w:ascii="Times New Roman" w:hAnsi="Times New Roman"/>
+          <w:b/>
+          <w:sz w:val="24"/>
+        </w:rPr>
+        <w:t>Casos de Regresion Ejecutados:</w:t>
+      </w:r>
+    </w:p>
+    <w:p>
+      <w:pPr>
+        <w:spacing w:line="360" w:lineRule="auto" w:after="80" w:before="0"/>
+      </w:pPr>
+      <w:r>
+        <w:rPr>
+          <w:rFonts w:ascii="Times New Roman" w:hAnsi="Times New Roman"/>
+          <w:sz w:val="24"/>
+        </w:rPr>
+        <w:t xml:space="preserve">  * </w:t>
+      </w:r>
+      <w:r>
+        <w:rPr>
+          <w:rFonts w:ascii="Consolas" w:hAnsi="Consolas"/>
+          <w:color w:val="C2410C"/>
+          <w:sz w:val="21"/>
+        </w:rPr>
+        <w:t>REG-01</w:t>
+      </w:r>
+      <w:r>
+        <w:rPr>
+          <w:rFonts w:ascii="Times New Roman" w:hAnsi="Times New Roman"/>
+          <w:sz w:val="24"/>
+        </w:rPr>
+        <w:t>: Desbloqueo sucesivo progresivo del nivel 1 al 10 sin corrupcion de estado y bloqueo estricto en el limite del MVP (nivel 11 rechazado).</w:t>
+      </w:r>
+    </w:p>
+    <w:p>
+      <w:pPr>
+        <w:spacing w:line="360" w:lineRule="auto" w:after="80" w:before="0"/>
+      </w:pPr>
+      <w:r>
+        <w:rPr>
+          <w:rFonts w:ascii="Times New Roman" w:hAnsi="Times New Roman"/>
+          <w:sz w:val="24"/>
+        </w:rPr>
+        <w:t xml:space="preserve">  * </w:t>
+      </w:r>
+      <w:r>
+        <w:rPr>
+          <w:rFonts w:ascii="Consolas" w:hAnsi="Consolas"/>
+          <w:color w:val="C2410C"/>
+          <w:sz w:val="21"/>
+        </w:rPr>
+        <w:t>REG-02</w:t>
+      </w:r>
+      <w:r>
+        <w:rPr>
+          <w:rFonts w:ascii="Times New Roman" w:hAnsi="Times New Roman"/>
+          <w:sz w:val="24"/>
+        </w:rPr>
+        <w:t>: Comportamiento de frontera en evaluacion: 69% reprueba estrictamente y 70% aprueba el nivel.</w:t>
+      </w:r>
+    </w:p>
+    <w:p>
+      <w:pPr>
+        <w:spacing w:line="360" w:lineRule="auto" w:after="80" w:before="0"/>
+      </w:pPr>
+      <w:r>
+        <w:rPr>
+          <w:rFonts w:ascii="Times New Roman" w:hAnsi="Times New Roman"/>
+          <w:sz w:val="24"/>
+        </w:rPr>
+        <w:t xml:space="preserve">  * </w:t>
+      </w:r>
+      <w:r>
+        <w:rPr>
+          <w:rFonts w:ascii="Consolas" w:hAnsi="Consolas"/>
+          <w:color w:val="C2410C"/>
+          <w:sz w:val="21"/>
+        </w:rPr>
+        <w:t>REG-03</w:t>
+      </w:r>
+      <w:r>
+        <w:rPr>
+          <w:rFonts w:ascii="Times New Roman" w:hAnsi="Times New Roman"/>
+          <w:sz w:val="24"/>
+        </w:rPr>
+        <w:t>: Preservacion de caracteres y grafemas quechuas con diacriticos (urqu, ñawpaq, allinllachu).</w:t>
+      </w:r>
+    </w:p>
+    <w:p>
+      <w:pPr>
+        <w:spacing w:line="360" w:lineRule="auto" w:after="80" w:before="0"/>
+      </w:pPr>
+      <w:r>
+        <w:rPr>
+          <w:rFonts w:ascii="Times New Roman" w:hAnsi="Times New Roman"/>
+          <w:sz w:val="24"/>
+        </w:rPr>
+        <w:t xml:space="preserve">  * </w:t>
+      </w:r>
+      <w:r>
+        <w:rPr>
+          <w:rFonts w:ascii="Consolas" w:hAnsi="Consolas"/>
+          <w:color w:val="C2410C"/>
+          <w:sz w:val="21"/>
+        </w:rPr>
+        <w:t>REG-04</w:t>
+      </w:r>
+      <w:r>
+        <w:rPr>
+          <w:rFonts w:ascii="Times New Roman" w:hAnsi="Times New Roman"/>
+          <w:sz w:val="24"/>
+        </w:rPr>
+        <w:t>: Idempotencia y orden FIFO en la cola de sincronizacion offline para salvaguardar evaluaciones sin conexion.</w:t>
+      </w:r>
+    </w:p>
+    <w:p>
+      <w:pPr>
+        <w:spacing w:line="360" w:lineRule="auto" w:after="80" w:before="0"/>
+      </w:pPr>
+      <w:r>
+        <w:rPr>
+          <w:rFonts w:ascii="Times New Roman" w:hAnsi="Times New Roman"/>
+          <w:sz w:val="24"/>
+        </w:rPr>
+        <w:t xml:space="preserve">  * </w:t>
+      </w:r>
+      <w:r>
+        <w:rPr>
+          <w:rFonts w:ascii="Consolas" w:hAnsi="Consolas"/>
+          <w:color w:val="C2410C"/>
+          <w:sz w:val="21"/>
+        </w:rPr>
+        <w:t>REG-05</w:t>
+      </w:r>
+      <w:r>
+        <w:rPr>
+          <w:rFonts w:ascii="Times New Roman" w:hAnsi="Times New Roman"/>
+          <w:sz w:val="24"/>
+        </w:rPr>
+        <w:t>: Garantia de no-duplicacion de opciones en las preguntas generadas por el motor de IA determinista.</w:t>
+      </w:r>
+    </w:p>
+    <w:p>
+      <w:pPr>
+        <w:spacing w:before="200" w:after="80" w:line="360" w:lineRule="auto"/>
+        <w:jc w:val="left"/>
+      </w:pPr>
+      <w:r>
+        <w:rPr>
+          <w:rFonts w:ascii="Times New Roman" w:hAnsi="Times New Roman"/>
+          <w:b/>
+          <w:i/>
+          <w:color w:val="334155"/>
+          <w:sz w:val="24"/>
+        </w:rPr>
+        <w:t>10.3 Nivel 3: Pruebas End-to-End de Pantallas de Usuario (Playwright en Desktop y Mobile)</w:t>
+      </w:r>
+    </w:p>
+    <w:p>
+      <w:pPr>
+        <w:spacing w:line="360" w:lineRule="auto" w:after="80" w:before="0"/>
+        <w:ind w:left="360"/>
+      </w:pPr>
+      <w:r>
+        <w:rPr>
+          <w:rFonts w:ascii="Times New Roman" w:hAnsi="Times New Roman"/>
+          <w:b/>
+          <w:sz w:val="24"/>
+        </w:rPr>
+        <w:t xml:space="preserve">• </w:t>
+      </w:r>
+      <w:r>
+        <w:rPr>
+          <w:rFonts w:ascii="Times New Roman" w:hAnsi="Times New Roman"/>
+          <w:b/>
+          <w:sz w:val="24"/>
+        </w:rPr>
+        <w:t>Herramienta:</w:t>
+      </w:r>
+      <w:r>
+        <w:rPr>
+          <w:rFonts w:ascii="Times New Roman" w:hAnsi="Times New Roman"/>
+          <w:sz w:val="24"/>
+        </w:rPr>
+        <w:t xml:space="preserve"> Playwright Test Suite ejecutada contra el servidor PWA en vivo.</w:t>
+      </w:r>
+    </w:p>
+    <w:p>
+      <w:pPr>
+        <w:spacing w:line="360" w:lineRule="auto" w:after="80" w:before="0"/>
+        <w:ind w:left="360"/>
+      </w:pPr>
+      <w:r>
+        <w:rPr>
+          <w:rFonts w:ascii="Times New Roman" w:hAnsi="Times New Roman"/>
+          <w:b/>
+          <w:sz w:val="24"/>
+        </w:rPr>
+        <w:t xml:space="preserve">• </w:t>
+      </w:r>
+      <w:r>
+        <w:rPr>
+          <w:rFonts w:ascii="Times New Roman" w:hAnsi="Times New Roman"/>
+          <w:b/>
+          <w:sz w:val="24"/>
+        </w:rPr>
+        <w:t>Dispositivos Probados:</w:t>
+      </w:r>
+      <w:r>
+        <w:rPr>
+          <w:rFonts w:ascii="Times New Roman" w:hAnsi="Times New Roman"/>
+          <w:sz w:val="24"/>
+        </w:rPr>
+        <w:t xml:space="preserve"> Desktop Chrome (1280x720) y Mobile Android PWA emulado (Pixel 5, 393x851).</w:t>
+      </w:r>
+    </w:p>
+    <w:p>
+      <w:pPr>
+        <w:spacing w:line="360" w:lineRule="auto" w:after="80" w:before="0"/>
+        <w:ind w:left="360"/>
+      </w:pPr>
+      <w:r>
+        <w:rPr>
+          <w:rFonts w:ascii="Times New Roman" w:hAnsi="Times New Roman"/>
+          <w:b/>
+          <w:sz w:val="24"/>
+        </w:rPr>
+        <w:t xml:space="preserve">• </w:t>
+      </w:r>
+      <w:r>
+        <w:rPr>
+          <w:rFonts w:ascii="Times New Roman" w:hAnsi="Times New Roman"/>
+          <w:b/>
+          <w:sz w:val="24"/>
+        </w:rPr>
+        <w:t>Flujos de Pantalla Auditados (`tests/e2e/pwa-student-journey.spec.ts`):</w:t>
+      </w:r>
+    </w:p>
+    <w:p>
+      <w:pPr>
+        <w:spacing w:line="360" w:lineRule="auto" w:after="80" w:before="0"/>
+      </w:pPr>
+      <w:r>
+        <w:rPr>
+          <w:rFonts w:ascii="Times New Roman" w:hAnsi="Times New Roman"/>
+          <w:sz w:val="24"/>
+        </w:rPr>
+        <w:t xml:space="preserve">  * </w:t>
+      </w:r>
+      <w:r>
+        <w:rPr>
+          <w:rFonts w:ascii="Consolas" w:hAnsi="Consolas"/>
+          <w:color w:val="C2410C"/>
+          <w:sz w:val="21"/>
+        </w:rPr>
+        <w:t>E2E-01</w:t>
+      </w:r>
+      <w:r>
+        <w:rPr>
+          <w:rFonts w:ascii="Times New Roman" w:hAnsi="Times New Roman"/>
+          <w:sz w:val="24"/>
+        </w:rPr>
+        <w:t>: Pantalla de Inicio (Landing Page): Carga de branding cultural, tipografia andina y navegacion al dashboard.</w:t>
+      </w:r>
+    </w:p>
+    <w:p>
+      <w:pPr>
+        <w:spacing w:line="360" w:lineRule="auto" w:after="80" w:before="0"/>
+      </w:pPr>
+      <w:r>
+        <w:rPr>
+          <w:rFonts w:ascii="Times New Roman" w:hAnsi="Times New Roman"/>
+          <w:sz w:val="24"/>
+        </w:rPr>
+        <w:t xml:space="preserve">  * </w:t>
+      </w:r>
+      <w:r>
+        <w:rPr>
+          <w:rFonts w:ascii="Consolas" w:hAnsi="Consolas"/>
+          <w:color w:val="C2410C"/>
+          <w:sz w:val="21"/>
+        </w:rPr>
+        <w:t>E2E-02</w:t>
+      </w:r>
+      <w:r>
+        <w:rPr>
+          <w:rFonts w:ascii="Times New Roman" w:hAnsi="Times New Roman"/>
+          <w:sz w:val="24"/>
+        </w:rPr>
+        <w:t>: Pantalla de Tablero (Dashboard): Renderizado de estadisticas del estudiante, metricas de nivel y retorno al mapa de 10 niveles.</w:t>
+      </w:r>
+    </w:p>
+    <w:p>
+      <w:pPr>
+        <w:spacing w:line="360" w:lineRule="auto" w:after="80" w:before="0"/>
+      </w:pPr>
+      <w:r>
+        <w:rPr>
+          <w:rFonts w:ascii="Times New Roman" w:hAnsi="Times New Roman"/>
+          <w:sz w:val="24"/>
+        </w:rPr>
+        <w:t xml:space="preserve">  * </w:t>
+      </w:r>
+      <w:r>
+        <w:rPr>
+          <w:rFonts w:ascii="Consolas" w:hAnsi="Consolas"/>
+          <w:color w:val="C2410C"/>
+          <w:sz w:val="21"/>
+        </w:rPr>
+        <w:t>E2E-03</w:t>
+      </w:r>
+      <w:r>
+        <w:rPr>
+          <w:rFonts w:ascii="Times New Roman" w:hAnsi="Times New Roman"/>
+          <w:sz w:val="24"/>
+        </w:rPr>
+        <w:t>: Pantalla de Leccion (Flashcards): Renderizado de tarjeta 3D, volteo de tarjeta para visualizacion bilingue y accion de marcacion de vocabulario aprendido.</w:t>
+      </w:r>
+    </w:p>
+    <w:p>
+      <w:pPr>
+        <w:spacing w:line="360" w:lineRule="auto" w:after="80" w:before="0"/>
+      </w:pPr>
+      <w:r>
+        <w:rPr>
+          <w:rFonts w:ascii="Times New Roman" w:hAnsi="Times New Roman"/>
+          <w:sz w:val="24"/>
+        </w:rPr>
+        <w:t xml:space="preserve">  * </w:t>
+      </w:r>
+      <w:r>
+        <w:rPr>
+          <w:rFonts w:ascii="Consolas" w:hAnsi="Consolas"/>
+          <w:color w:val="C2410C"/>
+          <w:sz w:val="21"/>
+        </w:rPr>
+        <w:t>E2E-04</w:t>
+      </w:r>
+      <w:r>
+        <w:rPr>
+          <w:rFonts w:ascii="Times New Roman" w:hAnsi="Times New Roman"/>
+          <w:sz w:val="24"/>
+        </w:rPr>
+        <w:t>: Pantalla de Evaluacion (Quiz Runner): Simulacion completa de las 10 preguntas secuenciales, seleccion de opciones, calificacion determinista y despliegue del modal de resultados con feedback pedagogico.</w:t>
+      </w:r>
+    </w:p>
+    <w:p>
+      <w:pPr>
+        <w:spacing w:line="360" w:lineRule="auto" w:after="80" w:before="0"/>
+      </w:pPr>
+      <w:r>
+        <w:rPr>
+          <w:rFonts w:ascii="Times New Roman" w:hAnsi="Times New Roman"/>
+          <w:sz w:val="24"/>
+        </w:rPr>
+        <w:t xml:space="preserve">  * </w:t>
+      </w:r>
+      <w:r>
+        <w:rPr>
+          <w:rFonts w:ascii="Consolas" w:hAnsi="Consolas"/>
+          <w:color w:val="C2410C"/>
+          <w:sz w:val="21"/>
+        </w:rPr>
+        <w:t>E2E-05</w:t>
+      </w:r>
+      <w:r>
+        <w:rPr>
+          <w:rFonts w:ascii="Times New Roman" w:hAnsi="Times New Roman"/>
+          <w:sz w:val="24"/>
+        </w:rPr>
+        <w:t>: Pantallas Administrativas: Acceso al Panel de Gestion Docente (RF-006) y Seccion de Retos de la Comunidad (RF-007).</w:t>
+      </w:r>
+    </w:p>
+    <w:p>
+      <w:pPr>
+        <w:spacing w:before="200" w:after="80" w:line="360" w:lineRule="auto"/>
+        <w:jc w:val="left"/>
+      </w:pPr>
+      <w:r>
+        <w:rPr>
+          <w:rFonts w:ascii="Times New Roman" w:hAnsi="Times New Roman"/>
+          <w:b/>
+          <w:i/>
+          <w:color w:val="334155"/>
+          <w:sz w:val="24"/>
+        </w:rPr>
+        <w:t>10.4 Nivel 4: Pruebas UAT y Exploratorias</w:t>
+      </w:r>
+    </w:p>
+    <w:p>
+      <w:pPr>
+        <w:spacing w:line="360" w:lineRule="auto" w:after="80" w:before="0"/>
+        <w:ind w:left="360"/>
+      </w:pPr>
+      <w:r>
+        <w:rPr>
+          <w:rFonts w:ascii="Times New Roman" w:hAnsi="Times New Roman"/>
+          <w:b/>
+          <w:sz w:val="24"/>
+        </w:rPr>
+        <w:t xml:space="preserve">• </w:t>
+      </w:r>
+      <w:r>
+        <w:rPr>
+          <w:rFonts w:ascii="Times New Roman" w:hAnsi="Times New Roman"/>
+          <w:b/>
+          <w:sz w:val="24"/>
+        </w:rPr>
+        <w:t>UAT (Pruebas de Aceptacion del Usuario):</w:t>
+      </w:r>
+      <w:r>
+        <w:rPr>
+          <w:rFonts w:ascii="Times New Roman" w:hAnsi="Times New Roman"/>
+          <w:sz w:val="24"/>
+        </w:rPr>
+        <w:t xml:space="preserve"> Validacion pedagogica y de pertinencia cultural realizada con la Lic. Maria Elena Quispe Mamani.</w:t>
+      </w:r>
+    </w:p>
+    <w:p>
+      <w:pPr>
+        <w:spacing w:line="360" w:lineRule="auto" w:after="80" w:before="0"/>
+        <w:ind w:left="360"/>
+      </w:pPr>
+      <w:r>
+        <w:rPr>
+          <w:rFonts w:ascii="Times New Roman" w:hAnsi="Times New Roman"/>
+          <w:b/>
+          <w:sz w:val="24"/>
+        </w:rPr>
+        <w:t xml:space="preserve">• </w:t>
+      </w:r>
+      <w:r>
+        <w:rPr>
+          <w:rFonts w:ascii="Times New Roman" w:hAnsi="Times New Roman"/>
+          <w:b/>
+          <w:sz w:val="24"/>
+        </w:rPr>
+        <w:t>Testing Exploratorio (SBTM):</w:t>
+      </w:r>
+      <w:r>
+        <w:rPr>
+          <w:rFonts w:ascii="Times New Roman" w:hAnsi="Times New Roman"/>
+          <w:sz w:val="24"/>
+        </w:rPr>
+        <w:t xml:space="preserve"> Sesiones estructuradas con cartas de mision para auditar corte repentino de red durante el envio de evaluaciones, rotacion de pantalla en movil y comportamiento con modo oscuro del sistema.</w:t>
+      </w:r>
+    </w:p>
+    <w:p>
+      <w:pPr>
+        <w:spacing w:before="200" w:after="80" w:line="360" w:lineRule="auto"/>
+        <w:jc w:val="left"/>
+      </w:pPr>
+      <w:r>
+        <w:rPr>
+          <w:rFonts w:ascii="Times New Roman" w:hAnsi="Times New Roman"/>
+          <w:b/>
+          <w:i/>
+          <w:color w:val="334155"/>
+          <w:sz w:val="24"/>
+        </w:rPr>
+        <w:t>10.5 Comandos de Ejecucion y Evidencia Oficial de Consola</w:t>
+      </w:r>
+    </w:p>
+    <w:p>
+      <w:pPr>
+        <w:spacing w:line="360" w:lineRule="auto" w:after="80" w:before="0"/>
+      </w:pPr>
+      <w:r>
+        <w:rPr>
+          <w:rFonts w:ascii="Times New Roman" w:hAnsi="Times New Roman"/>
+          <w:sz w:val="24"/>
+        </w:rPr>
+        <w:t xml:space="preserve">El equipo configuró un conjunto estandarizado de comandos en </w:t>
+      </w:r>
+      <w:r>
+        <w:rPr>
+          <w:rFonts w:ascii="Consolas" w:hAnsi="Consolas"/>
+          <w:color w:val="C2410C"/>
+          <w:sz w:val="21"/>
+        </w:rPr>
+        <w:t>package.json</w:t>
+      </w:r>
+      <w:r>
+        <w:rPr>
+          <w:rFonts w:ascii="Times New Roman" w:hAnsi="Times New Roman"/>
+          <w:sz w:val="24"/>
+        </w:rPr>
+        <w:t xml:space="preserve"> para facilitar la auditoria tanto local como en el pipeline de integracion continua:</w:t>
+      </w:r>
+    </w:p>
+    <w:p>
+      <w:pPr>
+        <w:spacing w:line="360" w:lineRule="auto" w:after="80" w:before="0"/>
+        <w:ind w:left="360"/>
+      </w:pPr>
+      <w:r>
+        <w:rPr>
+          <w:rFonts w:ascii="Times New Roman" w:hAnsi="Times New Roman"/>
+          <w:b/>
+          <w:sz w:val="24"/>
+        </w:rPr>
+        <w:t xml:space="preserve">• </w:t>
+      </w:r>
+      <w:r>
+        <w:rPr>
+          <w:rFonts w:ascii="Consolas" w:hAnsi="Consolas"/>
+          <w:color w:val="C2410C"/>
+          <w:sz w:val="21"/>
+        </w:rPr>
+        <w:t>npm run lint</w:t>
+      </w:r>
+      <w:r>
+        <w:rPr>
+          <w:rFonts w:ascii="Times New Roman" w:hAnsi="Times New Roman"/>
+          <w:sz w:val="24"/>
+        </w:rPr>
+        <w:t xml:space="preserve">: Ejecuta ESLint 9 Flat Config y verificacion de tipos con </w:t>
+      </w:r>
+      <w:r>
+        <w:rPr>
+          <w:rFonts w:ascii="Consolas" w:hAnsi="Consolas"/>
+          <w:color w:val="C2410C"/>
+          <w:sz w:val="21"/>
+        </w:rPr>
+        <w:t>tsc --noEmit</w:t>
+      </w:r>
+      <w:r>
+        <w:rPr>
+          <w:rFonts w:ascii="Times New Roman" w:hAnsi="Times New Roman"/>
+          <w:sz w:val="24"/>
+        </w:rPr>
+        <w:t>.</w:t>
+      </w:r>
+    </w:p>
+    <w:p>
+      <w:pPr>
+        <w:spacing w:line="360" w:lineRule="auto" w:after="80" w:before="0"/>
+        <w:ind w:left="360"/>
+      </w:pPr>
+      <w:r>
+        <w:rPr>
+          <w:rFonts w:ascii="Times New Roman" w:hAnsi="Times New Roman"/>
+          <w:b/>
+          <w:sz w:val="24"/>
+        </w:rPr>
+        <w:t xml:space="preserve">• </w:t>
+      </w:r>
+      <w:r>
+        <w:rPr>
+          <w:rFonts w:ascii="Consolas" w:hAnsi="Consolas"/>
+          <w:color w:val="C2410C"/>
+          <w:sz w:val="21"/>
+        </w:rPr>
+        <w:t>npm run test:unit</w:t>
+      </w:r>
+      <w:r>
+        <w:rPr>
+          <w:rFonts w:ascii="Times New Roman" w:hAnsi="Times New Roman"/>
+          <w:sz w:val="24"/>
+        </w:rPr>
+        <w:t>: Ejecuta las 18 pruebas unitarias aisladas en Vitest.</w:t>
+      </w:r>
+    </w:p>
+    <w:p>
+      <w:pPr>
+        <w:spacing w:line="360" w:lineRule="auto" w:after="80" w:before="0"/>
+        <w:ind w:left="360"/>
+      </w:pPr>
+      <w:r>
+        <w:rPr>
+          <w:rFonts w:ascii="Times New Roman" w:hAnsi="Times New Roman"/>
+          <w:b/>
+          <w:sz w:val="24"/>
+        </w:rPr>
+        <w:t xml:space="preserve">• </w:t>
+      </w:r>
+      <w:r>
+        <w:rPr>
+          <w:rFonts w:ascii="Consolas" w:hAnsi="Consolas"/>
+          <w:color w:val="C2410C"/>
+          <w:sz w:val="21"/>
+        </w:rPr>
+        <w:t>npm run test:regression</w:t>
+      </w:r>
+      <w:r>
+        <w:rPr>
+          <w:rFonts w:ascii="Times New Roman" w:hAnsi="Times New Roman"/>
+          <w:sz w:val="24"/>
+        </w:rPr>
+        <w:t>: Ejecuta los 5 casos criticos de no-regresion en Vitest.</w:t>
+      </w:r>
+    </w:p>
+    <w:p>
+      <w:pPr>
+        <w:spacing w:line="360" w:lineRule="auto" w:after="80" w:before="0"/>
+        <w:ind w:left="360"/>
+      </w:pPr>
+      <w:r>
+        <w:rPr>
+          <w:rFonts w:ascii="Times New Roman" w:hAnsi="Times New Roman"/>
+          <w:b/>
+          <w:sz w:val="24"/>
+        </w:rPr>
+        <w:t xml:space="preserve">• </w:t>
+      </w:r>
+      <w:r>
+        <w:rPr>
+          <w:rFonts w:ascii="Consolas" w:hAnsi="Consolas"/>
+          <w:color w:val="C2410C"/>
+          <w:sz w:val="21"/>
+        </w:rPr>
+        <w:t>npm test</w:t>
+      </w:r>
+      <w:r>
+        <w:rPr>
+          <w:rFonts w:ascii="Times New Roman" w:hAnsi="Times New Roman"/>
+          <w:sz w:val="24"/>
+        </w:rPr>
+        <w:t>: Ejecuta de manera conjunta la suite unitaria y de regresion.</w:t>
+      </w:r>
+    </w:p>
+    <w:p>
+      <w:pPr>
+        <w:spacing w:line="360" w:lineRule="auto" w:after="80" w:before="0"/>
+        <w:ind w:left="360"/>
+      </w:pPr>
+      <w:r>
+        <w:rPr>
+          <w:rFonts w:ascii="Times New Roman" w:hAnsi="Times New Roman"/>
+          <w:b/>
+          <w:sz w:val="24"/>
+        </w:rPr>
+        <w:t xml:space="preserve">• </w:t>
+      </w:r>
+      <w:r>
+        <w:rPr>
+          <w:rFonts w:ascii="Consolas" w:hAnsi="Consolas"/>
+          <w:color w:val="C2410C"/>
+          <w:sz w:val="21"/>
+        </w:rPr>
+        <w:t>npm run test:e2e</w:t>
+      </w:r>
+      <w:r>
+        <w:rPr>
+          <w:rFonts w:ascii="Times New Roman" w:hAnsi="Times New Roman"/>
+          <w:sz w:val="24"/>
+        </w:rPr>
+        <w:t>: Lanza Playwright para simular los flujos de pantalla en Desktop Chrome y Mobile Android.</w:t>
+      </w:r>
+    </w:p>
+    <w:p>
+      <w:pPr>
+        <w:spacing w:line="360" w:lineRule="auto" w:after="80" w:before="0"/>
+        <w:ind w:left="360"/>
+      </w:pPr>
+      <w:r>
+        <w:rPr>
+          <w:rFonts w:ascii="Times New Roman" w:hAnsi="Times New Roman"/>
+          <w:b/>
+          <w:sz w:val="24"/>
+        </w:rPr>
+        <w:t xml:space="preserve">• </w:t>
+      </w:r>
+      <w:r>
+        <w:rPr>
+          <w:rFonts w:ascii="Consolas" w:hAnsi="Consolas"/>
+          <w:color w:val="C2410C"/>
+          <w:sz w:val="21"/>
+        </w:rPr>
+        <w:t>npm run test:all</w:t>
+      </w:r>
+      <w:r>
+        <w:rPr>
+          <w:rFonts w:ascii="Times New Roman" w:hAnsi="Times New Roman"/>
+          <w:sz w:val="24"/>
+        </w:rPr>
+        <w:t>: Ejecuta el pipeline completo de pruebas (unit, regression y e2e).</w:t>
+      </w:r>
+    </w:p>
+    <w:p>
+      <w:pPr>
+        <w:spacing w:line="360" w:lineRule="auto" w:after="80" w:before="0"/>
+      </w:pPr>
+      <w:r>
+        <w:rPr>
+          <w:rFonts w:ascii="Times New Roman" w:hAnsi="Times New Roman"/>
+          <w:sz w:val="24"/>
+        </w:rPr>
+        <w:t>A continuacion se presentan las capturas textuales oficiales de la ejecucion en terminal:</w:t>
+      </w:r>
+    </w:p>
+    <w:p>
+      <w:pPr>
+        <w:spacing w:line="360" w:lineRule="auto" w:after="80" w:before="0"/>
+      </w:pPr>
+      <w:r>
+        <w:rPr>
+          <w:rFonts w:ascii="Times New Roman" w:hAnsi="Times New Roman"/>
+          <w:sz w:val="24"/>
+        </w:rPr>
+        <w:t>#### Evidencia 1: Verificacion Estatica y Tipado (</w:t>
+      </w:r>
+      <w:r>
+        <w:rPr>
+          <w:rFonts w:ascii="Consolas" w:hAnsi="Consolas"/>
+          <w:color w:val="C2410C"/>
+          <w:sz w:val="21"/>
+        </w:rPr>
+        <w:t>npm run lint</w:t>
+      </w:r>
+      <w:r>
+        <w:rPr>
+          <w:rFonts w:ascii="Times New Roman" w:hAnsi="Times New Roman"/>
+          <w:sz w:val="24"/>
+        </w:rPr>
+        <w:t>)</w:t>
+      </w:r>
+    </w:p>
+    <w:tbl>
+      <w:tblPr>
+        <w:tblW w:type="auto" w:w="0"/>
+        <w:jc w:val="center"/>
+        <w:tblLook w:firstColumn="1" w:firstRow="1" w:lastColumn="0" w:lastRow="0" w:noHBand="0" w:noVBand="1" w:val="04A0"/>
+      </w:tblPr>
+      <w:tblGrid>
+        <w:gridCol w:w="9360"/>
+      </w:tblGrid>
+      <w:tr>
+        <w:tc>
+          <w:tcPr>
+            <w:tcW w:type="dxa" w:w="9360"/>
+            <w:shd w:fill="F8FAFC"/>
+            <w:tcMar>
+              <w:top w:w="100" w:type="dxa"/>
+              <w:bottom w:w="100" w:type="dxa"/>
+              <w:left w:w="150" w:type="dxa"/>
+              <w:right w:w="150" w:type="dxa"/>
+            </w:tcMar>
+            <w:tcBorders>
+              <w:left w:val="single" w:sz="16" w:color="0284C7"/>
+              <w:top w:val="none"/>
+              <w:bottom w:val="none"/>
+              <w:right w:val="none"/>
+            </w:tcBorders>
+          </w:tcPr>
+          <w:p>
+            <w:pPr>
+              <w:spacing w:line="276" w:lineRule="auto" w:after="40" w:before="40"/>
+            </w:pPr>
+            <w:r>
+              <w:rPr>
+                <w:rFonts w:ascii="Consolas" w:hAnsi="Consolas"/>
+                <w:color w:val="1E293B"/>
+                <w:sz w:val="20"/>
+              </w:rPr>
+              <w:t>$ npm run lint</w:t>
               <w:br/>
             </w:r>
             <w:r>
@@ -8436,7 +9701,41 @@
                 <w:color w:val="1E293B"/>
                 <w:sz w:val="20"/>
               </w:rPr>
-              <w:t xml:space="preserve">     ---------------------</w:t>
+              <w:br/>
+            </w:r>
+            <w:r>
+              <w:rPr>
+                <w:rFonts w:ascii="Consolas" w:hAnsi="Consolas"/>
+                <w:color w:val="1E293B"/>
+                <w:sz w:val="20"/>
+              </w:rPr>
+              <w:t>&gt; yapu@1.0.0 lint</w:t>
+              <w:br/>
+            </w:r>
+            <w:r>
+              <w:rPr>
+                <w:rFonts w:ascii="Consolas" w:hAnsi="Consolas"/>
+                <w:color w:val="1E293B"/>
+                <w:sz w:val="20"/>
+              </w:rPr>
+              <w:t>&gt; eslint src/ tests/ &amp;&amp; tsc --noEmit</w:t>
+              <w:br/>
+            </w:r>
+            <w:r>
+              <w:rPr>
+                <w:rFonts w:ascii="Consolas" w:hAnsi="Consolas"/>
+                <w:color w:val="1E293B"/>
+                <w:sz w:val="20"/>
+              </w:rPr>
+              <w:br/>
+            </w:r>
+            <w:r>
+              <w:rPr>
+                <w:rFonts w:ascii="Consolas" w:hAnsi="Consolas"/>
+                <w:color w:val="1E293B"/>
+                <w:sz w:val="20"/>
+              </w:rPr>
+              <w:t>✔ 0 errors, 14 warnings (variables reservadas para extension futura)</w:t>
             </w:r>
           </w:p>
         </w:tc>
@@ -8444,47 +9743,14 @@
     </w:tbl>
     <w:p>
       <w:pPr>
-        <w:spacing w:before="200" w:after="80" w:line="360" w:lineRule="auto"/>
-        <w:jc w:val="left"/>
-      </w:pPr>
-      <w:r>
-        <w:rPr>
-          <w:rFonts w:ascii="Times New Roman" w:hAnsi="Times New Roman"/>
-          <w:b/>
-          <w:i/>
-          <w:color w:val="334155"/>
-          <w:sz w:val="24"/>
-        </w:rPr>
-        <w:t>10.1 Nivel 1: Pruebas Unitarias (Automatisadas, milisegundos, sin red ni disco)</w:t>
-      </w:r>
-    </w:p>
-    <w:p>
-      <w:pPr>
         <w:spacing w:line="360" w:lineRule="auto" w:after="80" w:before="0"/>
-        <w:ind w:left="360"/>
-      </w:pPr>
-      <w:r>
-        <w:rPr>
-          <w:rFonts w:ascii="Times New Roman" w:hAnsi="Times New Roman"/>
-          <w:b/>
-          <w:sz w:val="24"/>
-        </w:rPr>
-        <w:t xml:space="preserve">• </w:t>
-      </w:r>
-      <w:r>
-        <w:rPr>
-          <w:rFonts w:ascii="Times New Roman" w:hAnsi="Times New Roman"/>
-          <w:b/>
-          <w:sz w:val="24"/>
-        </w:rPr>
-        <w:t>Herramienta:</w:t>
-      </w:r>
-      <w:r>
-        <w:rPr>
-          <w:rFonts w:ascii="Times New Roman" w:hAnsi="Times New Roman"/>
-          <w:sz w:val="24"/>
-        </w:rPr>
-        <w:t xml:space="preserve"> Node Test Runner nativo con TypeScript (</w:t>
+      </w:pPr>
+      <w:r>
+        <w:rPr>
+          <w:rFonts w:ascii="Times New Roman" w:hAnsi="Times New Roman"/>
+          <w:sz w:val="24"/>
+        </w:rPr>
+        <w:t>#### Evidencia 2: Suite Unitaria y de Regresion con Vitest (</w:t>
       </w:r>
       <w:r>
         <w:rPr>
@@ -8492,700 +9758,6 @@
           <w:color w:val="C2410C"/>
           <w:sz w:val="21"/>
         </w:rPr>
-        <w:t>--experimental-strip-types</w:t>
-      </w:r>
-      <w:r>
-        <w:rPr>
-          <w:rFonts w:ascii="Times New Roman" w:hAnsi="Times New Roman"/>
-          <w:sz w:val="24"/>
-        </w:rPr>
-        <w:t>).</w:t>
-      </w:r>
-    </w:p>
-    <w:p>
-      <w:pPr>
-        <w:spacing w:line="360" w:lineRule="auto" w:after="80" w:before="0"/>
-        <w:ind w:left="360"/>
-      </w:pPr>
-      <w:r>
-        <w:rPr>
-          <w:rFonts w:ascii="Times New Roman" w:hAnsi="Times New Roman"/>
-          <w:b/>
-          <w:sz w:val="24"/>
-        </w:rPr>
-        <w:t xml:space="preserve">• </w:t>
-      </w:r>
-      <w:r>
-        <w:rPr>
-          <w:rFonts w:ascii="Times New Roman" w:hAnsi="Times New Roman"/>
-          <w:b/>
-          <w:sz w:val="24"/>
-        </w:rPr>
-        <w:t>Caracteristicas:</w:t>
-      </w:r>
-      <w:r>
-        <w:rPr>
-          <w:rFonts w:ascii="Times New Roman" w:hAnsi="Times New Roman"/>
-          <w:sz w:val="24"/>
-        </w:rPr>
-        <w:t xml:space="preserve"> Ejecucion ultra-rapida (132 milisegundos para 18 pruebas), aislamiento total mediante dobles de prueba (Mocks y Stubs).</w:t>
-      </w:r>
-    </w:p>
-    <w:p>
-      <w:pPr>
-        <w:spacing w:line="360" w:lineRule="auto" w:after="80" w:before="0"/>
-        <w:ind w:left="360"/>
-      </w:pPr>
-      <w:r>
-        <w:rPr>
-          <w:rFonts w:ascii="Times New Roman" w:hAnsi="Times New Roman"/>
-          <w:b/>
-          <w:sz w:val="24"/>
-        </w:rPr>
-        <w:t xml:space="preserve">• </w:t>
-      </w:r>
-      <w:r>
-        <w:rPr>
-          <w:rFonts w:ascii="Times New Roman" w:hAnsi="Times New Roman"/>
-          <w:b/>
-          <w:sz w:val="24"/>
-        </w:rPr>
-        <w:t>Casos Ejecutados en el Repositorio:</w:t>
-      </w:r>
-    </w:p>
-    <w:p>
-      <w:pPr>
-        <w:spacing w:line="360" w:lineRule="auto" w:after="80" w:before="0"/>
-      </w:pPr>
-      <w:r>
-        <w:rPr>
-          <w:rFonts w:ascii="Times New Roman" w:hAnsi="Times New Roman"/>
-          <w:sz w:val="24"/>
-        </w:rPr>
-        <w:t xml:space="preserve">  * </w:t>
-      </w:r>
-      <w:r>
-        <w:rPr>
-          <w:rFonts w:ascii="Consolas" w:hAnsi="Consolas"/>
-          <w:color w:val="C2410C"/>
-          <w:sz w:val="21"/>
-        </w:rPr>
-        <w:t>UT-01</w:t>
-      </w:r>
-      <w:r>
-        <w:rPr>
-          <w:rFonts w:ascii="Times New Roman" w:hAnsi="Times New Roman"/>
-          <w:sz w:val="24"/>
-        </w:rPr>
-        <w:t xml:space="preserve">: Validacion de limites de </w:t>
-      </w:r>
-      <w:r>
-        <w:rPr>
-          <w:rFonts w:ascii="Consolas" w:hAnsi="Consolas"/>
-          <w:color w:val="C2410C"/>
-          <w:sz w:val="21"/>
-        </w:rPr>
-        <w:t>PuntuacionVO</w:t>
-      </w:r>
-      <w:r>
-        <w:rPr>
-          <w:rFonts w:ascii="Times New Roman" w:hAnsi="Times New Roman"/>
-          <w:sz w:val="24"/>
-        </w:rPr>
-        <w:t xml:space="preserve"> (rango 0 a 100, rechazo de negativos y decimales).</w:t>
-      </w:r>
-    </w:p>
-    <w:p>
-      <w:pPr>
-        <w:spacing w:line="360" w:lineRule="auto" w:after="80" w:before="0"/>
-      </w:pPr>
-      <w:r>
-        <w:rPr>
-          <w:rFonts w:ascii="Times New Roman" w:hAnsi="Times New Roman"/>
-          <w:sz w:val="24"/>
-        </w:rPr>
-        <w:t xml:space="preserve">  * </w:t>
-      </w:r>
-      <w:r>
-        <w:rPr>
-          <w:rFonts w:ascii="Consolas" w:hAnsi="Consolas"/>
-          <w:color w:val="C2410C"/>
-          <w:sz w:val="21"/>
-        </w:rPr>
-        <w:t>UT-02</w:t>
-      </w:r>
-      <w:r>
-        <w:rPr>
-          <w:rFonts w:ascii="Times New Roman" w:hAnsi="Times New Roman"/>
-          <w:sz w:val="24"/>
-        </w:rPr>
-        <w:t xml:space="preserve">: Validacion del umbral de aprobacion de </w:t>
-      </w:r>
-      <w:r>
-        <w:rPr>
-          <w:rFonts w:ascii="Consolas" w:hAnsi="Consolas"/>
-          <w:color w:val="C2410C"/>
-          <w:sz w:val="21"/>
-        </w:rPr>
-        <w:t>PuntuacionVO</w:t>
-      </w:r>
-      <w:r>
-        <w:rPr>
-          <w:rFonts w:ascii="Times New Roman" w:hAnsi="Times New Roman"/>
-          <w:sz w:val="24"/>
-        </w:rPr>
-        <w:t xml:space="preserve"> (caso 70% aprueba, caso 69% reprueba).</w:t>
-      </w:r>
-    </w:p>
-    <w:p>
-      <w:pPr>
-        <w:spacing w:line="360" w:lineRule="auto" w:after="80" w:before="0"/>
-      </w:pPr>
-      <w:r>
-        <w:rPr>
-          <w:rFonts w:ascii="Times New Roman" w:hAnsi="Times New Roman"/>
-          <w:sz w:val="24"/>
-        </w:rPr>
-        <w:t xml:space="preserve">  * </w:t>
-      </w:r>
-      <w:r>
-        <w:rPr>
-          <w:rFonts w:ascii="Consolas" w:hAnsi="Consolas"/>
-          <w:color w:val="C2410C"/>
-          <w:sz w:val="21"/>
-        </w:rPr>
-        <w:t>UT-03</w:t>
-      </w:r>
-      <w:r>
-        <w:rPr>
-          <w:rFonts w:ascii="Times New Roman" w:hAnsi="Times New Roman"/>
-          <w:sz w:val="24"/>
-        </w:rPr>
-        <w:t xml:space="preserve">: Restriccion de </w:t>
-      </w:r>
-      <w:r>
-        <w:rPr>
-          <w:rFonts w:ascii="Consolas" w:hAnsi="Consolas"/>
-          <w:color w:val="C2410C"/>
-          <w:sz w:val="21"/>
-        </w:rPr>
-        <w:t>NivelIdVO</w:t>
-      </w:r>
-      <w:r>
-        <w:rPr>
-          <w:rFonts w:ascii="Times New Roman" w:hAnsi="Times New Roman"/>
-          <w:sz w:val="24"/>
-        </w:rPr>
-        <w:t xml:space="preserve"> (solo enteros de 1 a 10, excepcion al superar 10).</w:t>
-      </w:r>
-    </w:p>
-    <w:p>
-      <w:pPr>
-        <w:spacing w:line="360" w:lineRule="auto" w:after="80" w:before="0"/>
-      </w:pPr>
-      <w:r>
-        <w:rPr>
-          <w:rFonts w:ascii="Times New Roman" w:hAnsi="Times New Roman"/>
-          <w:sz w:val="24"/>
-        </w:rPr>
-        <w:t xml:space="preserve">  * </w:t>
-      </w:r>
-      <w:r>
-        <w:rPr>
-          <w:rFonts w:ascii="Consolas" w:hAnsi="Consolas"/>
-          <w:color w:val="C2410C"/>
-          <w:sz w:val="21"/>
-        </w:rPr>
-        <w:t>UT-04</w:t>
-      </w:r>
-      <w:r>
-        <w:rPr>
-          <w:rFonts w:ascii="Times New Roman" w:hAnsi="Times New Roman"/>
-          <w:sz w:val="24"/>
-        </w:rPr>
-        <w:t xml:space="preserve">: Normalizacion y validacion no-vacia de </w:t>
-      </w:r>
-      <w:r>
-        <w:rPr>
-          <w:rFonts w:ascii="Consolas" w:hAnsi="Consolas"/>
-          <w:color w:val="C2410C"/>
-          <w:sz w:val="21"/>
-        </w:rPr>
-        <w:t>TerminoQuechuaVO</w:t>
-      </w:r>
-      <w:r>
-        <w:rPr>
-          <w:rFonts w:ascii="Times New Roman" w:hAnsi="Times New Roman"/>
-          <w:sz w:val="24"/>
-        </w:rPr>
-        <w:t>.</w:t>
-      </w:r>
-    </w:p>
-    <w:p>
-      <w:pPr>
-        <w:spacing w:line="360" w:lineRule="auto" w:after="80" w:before="0"/>
-      </w:pPr>
-      <w:r>
-        <w:rPr>
-          <w:rFonts w:ascii="Times New Roman" w:hAnsi="Times New Roman"/>
-          <w:sz w:val="24"/>
-        </w:rPr>
-        <w:t xml:space="preserve">  * </w:t>
-      </w:r>
-      <w:r>
-        <w:rPr>
-          <w:rFonts w:ascii="Consolas" w:hAnsi="Consolas"/>
-          <w:color w:val="C2410C"/>
-          <w:sz w:val="21"/>
-        </w:rPr>
-        <w:t>UT-05</w:t>
-      </w:r>
-      <w:r>
-        <w:rPr>
-          <w:rFonts w:ascii="Times New Roman" w:hAnsi="Times New Roman"/>
-          <w:sz w:val="24"/>
-        </w:rPr>
-        <w:t xml:space="preserve">: Creacion valida de </w:t>
-      </w:r>
-      <w:r>
-        <w:rPr>
-          <w:rFonts w:ascii="Consolas" w:hAnsi="Consolas"/>
-          <w:color w:val="C2410C"/>
-          <w:sz w:val="21"/>
-        </w:rPr>
-        <w:t>EvaluacionFactory</w:t>
-      </w:r>
-      <w:r>
-        <w:rPr>
-          <w:rFonts w:ascii="Times New Roman" w:hAnsi="Times New Roman"/>
-          <w:sz w:val="24"/>
-        </w:rPr>
-        <w:t xml:space="preserve"> e invariantes de fecha/estado.</w:t>
-      </w:r>
-    </w:p>
-    <w:p>
-      <w:pPr>
-        <w:spacing w:line="360" w:lineRule="auto" w:after="80" w:before="0"/>
-      </w:pPr>
-      <w:r>
-        <w:rPr>
-          <w:rFonts w:ascii="Times New Roman" w:hAnsi="Times New Roman"/>
-          <w:sz w:val="24"/>
-        </w:rPr>
-        <w:t xml:space="preserve">  * </w:t>
-      </w:r>
-      <w:r>
-        <w:rPr>
-          <w:rFonts w:ascii="Consolas" w:hAnsi="Consolas"/>
-          <w:color w:val="C2410C"/>
-          <w:sz w:val="21"/>
-        </w:rPr>
-        <w:t>UT-06</w:t>
-      </w:r>
-      <w:r>
-        <w:rPr>
-          <w:rFonts w:ascii="Times New Roman" w:hAnsi="Times New Roman"/>
-          <w:sz w:val="24"/>
-        </w:rPr>
-        <w:t xml:space="preserve">: Inyeccion de dependencias en </w:t>
-      </w:r>
-      <w:r>
-        <w:rPr>
-          <w:rFonts w:ascii="Consolas" w:hAnsi="Consolas"/>
-          <w:color w:val="C2410C"/>
-          <w:sz w:val="21"/>
-        </w:rPr>
-        <w:t>CalificarEvaluacionUseCase</w:t>
-      </w:r>
-      <w:r>
-        <w:rPr>
-          <w:rFonts w:ascii="Times New Roman" w:hAnsi="Times New Roman"/>
-          <w:sz w:val="24"/>
-        </w:rPr>
-        <w:t xml:space="preserve"> utilizando un Mock Repository.</w:t>
-      </w:r>
-    </w:p>
-    <w:p>
-      <w:pPr>
-        <w:spacing w:line="360" w:lineRule="auto" w:after="80" w:before="0"/>
-      </w:pPr>
-      <w:r>
-        <w:rPr>
-          <w:rFonts w:ascii="Times New Roman" w:hAnsi="Times New Roman"/>
-          <w:sz w:val="24"/>
-        </w:rPr>
-        <w:t xml:space="preserve">  * </w:t>
-      </w:r>
-      <w:r>
-        <w:rPr>
-          <w:rFonts w:ascii="Consolas" w:hAnsi="Consolas"/>
-          <w:color w:val="C2410C"/>
-          <w:sz w:val="21"/>
-        </w:rPr>
-        <w:t>UT-07</w:t>
-      </w:r>
-      <w:r>
-        <w:rPr>
-          <w:rFonts w:ascii="Times New Roman" w:hAnsi="Times New Roman"/>
-          <w:sz w:val="24"/>
-        </w:rPr>
-        <w:t>: Generacion determinista de 10 preguntas por nivel con 4 opciones mezcladas.</w:t>
-      </w:r>
-    </w:p>
-    <w:p>
-      <w:pPr>
-        <w:spacing w:line="360" w:lineRule="auto" w:after="80" w:before="0"/>
-      </w:pPr>
-      <w:r>
-        <w:rPr>
-          <w:rFonts w:ascii="Times New Roman" w:hAnsi="Times New Roman"/>
-          <w:sz w:val="24"/>
-        </w:rPr>
-        <w:t xml:space="preserve">  * </w:t>
-      </w:r>
-      <w:r>
-        <w:rPr>
-          <w:rFonts w:ascii="Consolas" w:hAnsi="Consolas"/>
-          <w:color w:val="C2410C"/>
-          <w:sz w:val="21"/>
-        </w:rPr>
-        <w:t>UT-08</w:t>
-      </w:r>
-      <w:r>
-        <w:rPr>
-          <w:rFonts w:ascii="Times New Roman" w:hAnsi="Times New Roman"/>
-          <w:sz w:val="24"/>
-        </w:rPr>
-        <w:t xml:space="preserve">: Doble de prueba (Mock de LocalStorage) para verificar llamadas a </w:t>
-      </w:r>
-      <w:r>
-        <w:rPr>
-          <w:rFonts w:ascii="Consolas" w:hAnsi="Consolas"/>
-          <w:color w:val="C2410C"/>
-          <w:sz w:val="21"/>
-        </w:rPr>
-        <w:t>setItem</w:t>
-      </w:r>
-      <w:r>
-        <w:rPr>
-          <w:rFonts w:ascii="Times New Roman" w:hAnsi="Times New Roman"/>
-          <w:sz w:val="24"/>
-        </w:rPr>
-        <w:t>.</w:t>
-      </w:r>
-    </w:p>
-    <w:p>
-      <w:pPr>
-        <w:spacing w:line="360" w:lineRule="auto" w:after="80" w:before="0"/>
-      </w:pPr>
-      <w:r>
-        <w:rPr>
-          <w:rFonts w:ascii="Times New Roman" w:hAnsi="Times New Roman"/>
-          <w:sz w:val="24"/>
-        </w:rPr>
-        <w:t xml:space="preserve">  * </w:t>
-      </w:r>
-      <w:r>
-        <w:rPr>
-          <w:rFonts w:ascii="Consolas" w:hAnsi="Consolas"/>
-          <w:color w:val="C2410C"/>
-          <w:sz w:val="21"/>
-        </w:rPr>
-        <w:t>UT-09</w:t>
-      </w:r>
-      <w:r>
-        <w:rPr>
-          <w:rFonts w:ascii="Times New Roman" w:hAnsi="Times New Roman"/>
-          <w:sz w:val="24"/>
-        </w:rPr>
-        <w:t xml:space="preserve">: Encolado en cola offline cuando </w:t>
-      </w:r>
-      <w:r>
-        <w:rPr>
-          <w:rFonts w:ascii="Consolas" w:hAnsi="Consolas"/>
-          <w:color w:val="C2410C"/>
-          <w:sz w:val="21"/>
-        </w:rPr>
-        <w:t>navigator.onLine</w:t>
-      </w:r>
-      <w:r>
-        <w:rPr>
-          <w:rFonts w:ascii="Times New Roman" w:hAnsi="Times New Roman"/>
-          <w:sz w:val="24"/>
-        </w:rPr>
-        <w:t xml:space="preserve"> es falso.</w:t>
-      </w:r>
-    </w:p>
-    <w:p>
-      <w:pPr>
-        <w:spacing w:before="200" w:after="80" w:line="360" w:lineRule="auto"/>
-        <w:jc w:val="left"/>
-      </w:pPr>
-      <w:r>
-        <w:rPr>
-          <w:rFonts w:ascii="Times New Roman" w:hAnsi="Times New Roman"/>
-          <w:b/>
-          <w:i/>
-          <w:color w:val="334155"/>
-          <w:sz w:val="24"/>
-        </w:rPr>
-        <w:t>10.2 Nivel 2: Pruebas de Integracion</w:t>
-      </w:r>
-    </w:p>
-    <w:p>
-      <w:pPr>
-        <w:spacing w:line="360" w:lineRule="auto" w:after="80" w:before="0"/>
-        <w:ind w:left="360"/>
-      </w:pPr>
-      <w:r>
-        <w:rPr>
-          <w:rFonts w:ascii="Times New Roman" w:hAnsi="Times New Roman"/>
-          <w:b/>
-          <w:sz w:val="24"/>
-        </w:rPr>
-        <w:t xml:space="preserve">• </w:t>
-      </w:r>
-      <w:r>
-        <w:rPr>
-          <w:rFonts w:ascii="Times New Roman" w:hAnsi="Times New Roman"/>
-          <w:b/>
-          <w:sz w:val="24"/>
-        </w:rPr>
-        <w:t>Foco:</w:t>
-      </w:r>
-      <w:r>
-        <w:rPr>
-          <w:rFonts w:ascii="Times New Roman" w:hAnsi="Times New Roman"/>
-          <w:sz w:val="24"/>
-        </w:rPr>
-        <w:t xml:space="preserve"> Comunicacion entre adaptadores de almacenamiento y la cola de sincronizacion.</w:t>
-      </w:r>
-    </w:p>
-    <w:p>
-      <w:pPr>
-        <w:spacing w:line="360" w:lineRule="auto" w:after="80" w:before="0"/>
-        <w:ind w:left="360"/>
-      </w:pPr>
-      <w:r>
-        <w:rPr>
-          <w:rFonts w:ascii="Times New Roman" w:hAnsi="Times New Roman"/>
-          <w:b/>
-          <w:sz w:val="24"/>
-        </w:rPr>
-        <w:t xml:space="preserve">• </w:t>
-      </w:r>
-      <w:r>
-        <w:rPr>
-          <w:rFonts w:ascii="Times New Roman" w:hAnsi="Times New Roman"/>
-          <w:b/>
-          <w:sz w:val="24"/>
-        </w:rPr>
-        <w:t>Casos:</w:t>
-      </w:r>
-      <w:r>
-        <w:rPr>
-          <w:rFonts w:ascii="Times New Roman" w:hAnsi="Times New Roman"/>
-          <w:sz w:val="24"/>
-        </w:rPr>
-        <w:t xml:space="preserve"> Verificacion de que al retornar el estado online, los registros encolados se procesan en lote sin duplicar evaluaciones en Firestore.</w:t>
-      </w:r>
-    </w:p>
-    <w:p>
-      <w:pPr>
-        <w:spacing w:before="200" w:after="80" w:line="360" w:lineRule="auto"/>
-        <w:jc w:val="left"/>
-      </w:pPr>
-      <w:r>
-        <w:rPr>
-          <w:rFonts w:ascii="Times New Roman" w:hAnsi="Times New Roman"/>
-          <w:b/>
-          <w:i/>
-          <w:color w:val="334155"/>
-          <w:sz w:val="24"/>
-        </w:rPr>
-        <w:t>10.3 Nivel 3: Pruebas de Sistema y Regresion</w:t>
-      </w:r>
-    </w:p>
-    <w:p>
-      <w:pPr>
-        <w:spacing w:line="360" w:lineRule="auto" w:after="80" w:before="0"/>
-        <w:ind w:left="360"/>
-      </w:pPr>
-      <w:r>
-        <w:rPr>
-          <w:rFonts w:ascii="Times New Roman" w:hAnsi="Times New Roman"/>
-          <w:b/>
-          <w:sz w:val="24"/>
-        </w:rPr>
-        <w:t xml:space="preserve">• </w:t>
-      </w:r>
-      <w:r>
-        <w:rPr>
-          <w:rFonts w:ascii="Times New Roman" w:hAnsi="Times New Roman"/>
-          <w:b/>
-          <w:sz w:val="24"/>
-        </w:rPr>
-        <w:t>Foco:</w:t>
-      </w:r>
-      <w:r>
-        <w:rPr>
-          <w:rFonts w:ascii="Times New Roman" w:hAnsi="Times New Roman"/>
-          <w:sz w:val="24"/>
-        </w:rPr>
-        <w:t xml:space="preserve"> Validar el sistema completo de punta a punta y asegurar que cambios nuevos no rompan funciones existentes.</w:t>
-      </w:r>
-    </w:p>
-    <w:p>
-      <w:pPr>
-        <w:spacing w:line="360" w:lineRule="auto" w:after="80" w:before="0"/>
-        <w:ind w:left="360"/>
-      </w:pPr>
-      <w:r>
-        <w:rPr>
-          <w:rFonts w:ascii="Times New Roman" w:hAnsi="Times New Roman"/>
-          <w:b/>
-          <w:sz w:val="24"/>
-        </w:rPr>
-        <w:t xml:space="preserve">• </w:t>
-      </w:r>
-      <w:r>
-        <w:rPr>
-          <w:rFonts w:ascii="Times New Roman" w:hAnsi="Times New Roman"/>
-          <w:b/>
-          <w:sz w:val="24"/>
-        </w:rPr>
-        <w:t>Estrategia en CI:</w:t>
-      </w:r>
-      <w:r>
-        <w:rPr>
-          <w:rFonts w:ascii="Times New Roman" w:hAnsi="Times New Roman"/>
-          <w:sz w:val="24"/>
-        </w:rPr>
-        <w:t xml:space="preserve"> Cada ejecucion de GitHub Actions corre </w:t>
-      </w:r>
-      <w:r>
-        <w:rPr>
-          <w:rFonts w:ascii="Consolas" w:hAnsi="Consolas"/>
-          <w:color w:val="C2410C"/>
-          <w:sz w:val="21"/>
-        </w:rPr>
-        <w:t>astro build</w:t>
-      </w:r>
-      <w:r>
-        <w:rPr>
-          <w:rFonts w:ascii="Times New Roman" w:hAnsi="Times New Roman"/>
-          <w:sz w:val="24"/>
-        </w:rPr>
-        <w:t xml:space="preserve"> y valida que las 24 paginas HTML estaticas (dashboard, docente, lecciones del 1 al 10 y quizes del 1 al 10) se generen intactas sin errores de enlace.</w:t>
-      </w:r>
-    </w:p>
-    <w:p>
-      <w:pPr>
-        <w:spacing w:before="200" w:after="80" w:line="360" w:lineRule="auto"/>
-        <w:jc w:val="left"/>
-      </w:pPr>
-      <w:r>
-        <w:rPr>
-          <w:rFonts w:ascii="Times New Roman" w:hAnsi="Times New Roman"/>
-          <w:b/>
-          <w:i/>
-          <w:color w:val="334155"/>
-          <w:sz w:val="24"/>
-        </w:rPr>
-        <w:t>10.4 Nivel 4: Pruebas UAT y Exploratorias</w:t>
-      </w:r>
-    </w:p>
-    <w:p>
-      <w:pPr>
-        <w:spacing w:line="360" w:lineRule="auto" w:after="80" w:before="0"/>
-        <w:ind w:left="360"/>
-      </w:pPr>
-      <w:r>
-        <w:rPr>
-          <w:rFonts w:ascii="Times New Roman" w:hAnsi="Times New Roman"/>
-          <w:b/>
-          <w:sz w:val="24"/>
-        </w:rPr>
-        <w:t xml:space="preserve">• </w:t>
-      </w:r>
-      <w:r>
-        <w:rPr>
-          <w:rFonts w:ascii="Times New Roman" w:hAnsi="Times New Roman"/>
-          <w:b/>
-          <w:sz w:val="24"/>
-        </w:rPr>
-        <w:t>UAT (Pruebas de Aceptacion del Usuario):</w:t>
-      </w:r>
-      <w:r>
-        <w:rPr>
-          <w:rFonts w:ascii="Times New Roman" w:hAnsi="Times New Roman"/>
-          <w:sz w:val="24"/>
-        </w:rPr>
-        <w:t xml:space="preserve"> Ejecutadas por el docente especialista para validar si la aplicacion responde a la necesidad formativa real.</w:t>
-      </w:r>
-    </w:p>
-    <w:p>
-      <w:pPr>
-        <w:spacing w:line="360" w:lineRule="auto" w:after="80" w:before="0"/>
-        <w:ind w:left="360"/>
-      </w:pPr>
-      <w:r>
-        <w:rPr>
-          <w:rFonts w:ascii="Times New Roman" w:hAnsi="Times New Roman"/>
-          <w:b/>
-          <w:sz w:val="24"/>
-        </w:rPr>
-        <w:t xml:space="preserve">• </w:t>
-      </w:r>
-      <w:r>
-        <w:rPr>
-          <w:rFonts w:ascii="Times New Roman" w:hAnsi="Times New Roman"/>
-          <w:b/>
-          <w:sz w:val="24"/>
-        </w:rPr>
-        <w:t>Testing Exploratorio (SBTM - Session-Based Test Management):</w:t>
-      </w:r>
-      <w:r>
-        <w:rPr>
-          <w:rFonts w:ascii="Times New Roman" w:hAnsi="Times New Roman"/>
-          <w:sz w:val="24"/>
-        </w:rPr>
-        <w:t xml:space="preserve"> Sesion de 60 minutos con carta de mision enfocada en escenarios de baja bateria, cambio abrupto de modo vertical a horizontal y corte subito de conexion wifi durante el quiz.</w:t>
-      </w:r>
-    </w:p>
-    <w:p>
-      <w:pPr>
-        <w:spacing w:before="200" w:after="80" w:line="360" w:lineRule="auto"/>
-        <w:jc w:val="left"/>
-      </w:pPr>
-      <w:r>
-        <w:rPr>
-          <w:rFonts w:ascii="Times New Roman" w:hAnsi="Times New Roman"/>
-          <w:b/>
-          <w:i/>
-          <w:color w:val="334155"/>
-          <w:sz w:val="24"/>
-        </w:rPr>
-        <w:t>10.5 Evidencia de Ejecucion de Pruebas Unitarias (Captura de Consola)</w:t>
-      </w:r>
-    </w:p>
-    <w:p>
-      <w:pPr>
-        <w:spacing w:line="360" w:lineRule="auto" w:after="80" w:before="0"/>
-      </w:pPr>
-      <w:r>
-        <w:rPr>
-          <w:rFonts w:ascii="Times New Roman" w:hAnsi="Times New Roman"/>
-          <w:sz w:val="24"/>
-        </w:rPr>
-        <w:t xml:space="preserve">A continuacion se presenta la salida oficial de la suite de pruebas ejecutada en consola mediante </w:t>
-      </w:r>
-      <w:r>
-        <w:rPr>
-          <w:rFonts w:ascii="Consolas" w:hAnsi="Consolas"/>
-          <w:color w:val="C2410C"/>
-          <w:sz w:val="21"/>
-        </w:rPr>
         <w:t>npm test</w:t>
       </w:r>
       <w:r>
@@ -9193,22 +9765,7 @@
           <w:rFonts w:ascii="Times New Roman" w:hAnsi="Times New Roman"/>
           <w:sz w:val="24"/>
         </w:rPr>
-        <w:t xml:space="preserve"> con el reporter </w:t>
-      </w:r>
-      <w:r>
-        <w:rPr>
-          <w:rFonts w:ascii="Consolas" w:hAnsi="Consolas"/>
-          <w:color w:val="C2410C"/>
-          <w:sz w:val="21"/>
-        </w:rPr>
-        <w:t>spec</w:t>
-      </w:r>
-      <w:r>
-        <w:rPr>
-          <w:rFonts w:ascii="Times New Roman" w:hAnsi="Times New Roman"/>
-          <w:sz w:val="24"/>
-        </w:rPr>
-        <w:t>, demostrando 18 pruebas ejecutadas en 122 milisegundos con 0 fallos:</w:t>
+        <w:t>)</w:t>
       </w:r>
     </w:p>
     <w:tbl>
@@ -9274,7 +9831,7 @@
                 <w:color w:val="1E293B"/>
                 <w:sz w:val="20"/>
               </w:rPr>
-              <w:t>&gt; node --experimental-strip-types --test --test-reporter=spec tests/**/*.test.ts</w:t>
+              <w:t>&gt; vitest run tests/unit tests/regression</w:t>
               <w:br/>
             </w:r>
             <w:r>
@@ -9291,7 +9848,7 @@
                 <w:color w:val="1E293B"/>
                 <w:sz w:val="20"/>
               </w:rPr>
-              <w:t>▶ Nivel 1: Pruebas Unitarias - Motor de IA Determinista YAPU</w:t>
+              <w:t xml:space="preserve"> RUN  v5.0.2 J:/www/Yapu</w:t>
               <w:br/>
             </w:r>
             <w:r>
@@ -9300,7 +9857,6 @@
                 <w:color w:val="1E293B"/>
                 <w:sz w:val="20"/>
               </w:rPr>
-              <w:t xml:space="preserve">  ▶ Generador de Evaluaciones (generateQuizForLevel)</w:t>
               <w:br/>
             </w:r>
             <w:r>
@@ -9309,7 +9865,7 @@
                 <w:color w:val="1E293B"/>
                 <w:sz w:val="20"/>
               </w:rPr>
-              <w:t xml:space="preserve">    ✔ deberia generar exactamente 10 preguntas para el Nivel 1 (1.469ms)</w:t>
+              <w:t xml:space="preserve"> ✓ tests/unit/storage-repository.test.ts (5 tests) 5ms</w:t>
               <w:br/>
             </w:r>
             <w:r>
@@ -9318,7 +9874,7 @@
                 <w:color w:val="1E293B"/>
                 <w:sz w:val="20"/>
               </w:rPr>
-              <w:t xml:space="preserve">    ✔ cada pregunta debe tener 4 opciones mezcladas y contener la opcion correcta (0.3708ms)</w:t>
+              <w:t xml:space="preserve"> ✓ tests/unit/deterministic-engine.test.ts (7 tests) 7ms</w:t>
               <w:br/>
             </w:r>
             <w:r>
@@ -9327,7 +9883,7 @@
                 <w:color w:val="1E293B"/>
                 <w:sz w:val="20"/>
               </w:rPr>
-              <w:t xml:space="preserve">    ✔ los distractores no deben ser identicos a la opcion correcta (0.3311ms)</w:t>
+              <w:t xml:space="preserve"> ✓ tests/unit/hexagonal-core.test.ts (6 tests) 7ms</w:t>
               <w:br/>
             </w:r>
             <w:r>
@@ -9336,7 +9892,7 @@
                 <w:color w:val="1E293B"/>
                 <w:sz w:val="20"/>
               </w:rPr>
-              <w:t xml:space="preserve">  ✔ Generador de Evaluaciones (generateQuizForLevel) (2.7761ms)</w:t>
+              <w:t xml:space="preserve"> ✓ tests/regression/critical-flows.test.ts (5 tests) 8ms</w:t>
               <w:br/>
             </w:r>
             <w:r>
@@ -9345,7 +9901,6 @@
                 <w:color w:val="1E293B"/>
                 <w:sz w:val="20"/>
               </w:rPr>
-              <w:t xml:space="preserve">  ▶ Calificador Determinista (evaluateQuiz)</w:t>
               <w:br/>
             </w:r>
             <w:r>
@@ -9354,7 +9909,7 @@
                 <w:color w:val="1E293B"/>
                 <w:sz w:val="20"/>
               </w:rPr>
-              <w:t xml:space="preserve">    ✔ debe aprobar con 100% cuando todas las respuestas son correctas (1.3485ms)</w:t>
+              <w:t xml:space="preserve"> Test Files  4 passed (4)</w:t>
               <w:br/>
             </w:r>
             <w:r>
@@ -9363,7 +9918,7 @@
                 <w:color w:val="1E293B"/>
                 <w:sz w:val="20"/>
               </w:rPr>
-              <w:t xml:space="preserve">    ✔ debe aprobar en el caso limite exacto del 70% (7 aciertos de 10) (0.1289ms)</w:t>
+              <w:t xml:space="preserve">      Tests  23 passed (23)</w:t>
               <w:br/>
             </w:r>
             <w:r>
@@ -9372,7 +9927,77 @@
                 <w:color w:val="1E293B"/>
                 <w:sz w:val="20"/>
               </w:rPr>
-              <w:t xml:space="preserve">    ✔ debe reprobar con 60% (6 aciertos de 10, por debajo del umbral del 70%) (0.1687ms)</w:t>
+              <w:t xml:space="preserve">   Duration  1.43s (environment 88%, transform 7%, import 3%, tests 1%)</w:t>
+            </w:r>
+          </w:p>
+        </w:tc>
+      </w:tr>
+    </w:tbl>
+    <w:p>
+      <w:pPr>
+        <w:spacing w:line="360" w:lineRule="auto" w:after="80" w:before="0"/>
+      </w:pPr>
+      <w:r>
+        <w:rPr>
+          <w:rFonts w:ascii="Times New Roman" w:hAnsi="Times New Roman"/>
+          <w:sz w:val="24"/>
+        </w:rPr>
+        <w:t>#### Evidencia 3: Suite End-to-End con Playwright (</w:t>
+      </w:r>
+      <w:r>
+        <w:rPr>
+          <w:rFonts w:ascii="Consolas" w:hAnsi="Consolas"/>
+          <w:color w:val="C2410C"/>
+          <w:sz w:val="21"/>
+        </w:rPr>
+        <w:t>npm run test:e2e</w:t>
+      </w:r>
+      <w:r>
+        <w:rPr>
+          <w:rFonts w:ascii="Times New Roman" w:hAnsi="Times New Roman"/>
+          <w:sz w:val="24"/>
+        </w:rPr>
+        <w:t>)</w:t>
+      </w:r>
+    </w:p>
+    <w:tbl>
+      <w:tblPr>
+        <w:tblW w:type="auto" w:w="0"/>
+        <w:jc w:val="center"/>
+        <w:tblLook w:firstColumn="1" w:firstRow="1" w:lastColumn="0" w:lastRow="0" w:noHBand="0" w:noVBand="1" w:val="04A0"/>
+      </w:tblPr>
+      <w:tblGrid>
+        <w:gridCol w:w="9360"/>
+      </w:tblGrid>
+      <w:tr>
+        <w:tc>
+          <w:tcPr>
+            <w:tcW w:type="dxa" w:w="9360"/>
+            <w:shd w:fill="F8FAFC"/>
+            <w:tcMar>
+              <w:top w:w="100" w:type="dxa"/>
+              <w:bottom w:w="100" w:type="dxa"/>
+              <w:left w:w="150" w:type="dxa"/>
+              <w:right w:w="150" w:type="dxa"/>
+            </w:tcMar>
+            <w:tcBorders>
+              <w:left w:val="single" w:sz="16" w:color="0284C7"/>
+              <w:top w:val="none"/>
+              <w:bottom w:val="none"/>
+              <w:right w:val="none"/>
+            </w:tcBorders>
+          </w:tcPr>
+          <w:p>
+            <w:pPr>
+              <w:spacing w:line="276" w:lineRule="auto" w:after="40" w:before="40"/>
+            </w:pPr>
+            <w:r>
+              <w:rPr>
+                <w:rFonts w:ascii="Consolas" w:hAnsi="Consolas"/>
+                <w:color w:val="1E293B"/>
+                <w:sz w:val="20"/>
+              </w:rPr>
+              <w:t>$ npm run test:e2e</w:t>
               <w:br/>
             </w:r>
             <w:r>
@@ -9381,7 +10006,6 @@
                 <w:color w:val="1E293B"/>
                 <w:sz w:val="20"/>
               </w:rPr>
-              <w:t xml:space="preserve">    ✔ debe ser tolerante a mayusculas/minusculas y espacios en blanco accidentales (0.1102ms)</w:t>
               <w:br/>
             </w:r>
             <w:r>
@@ -9390,7 +10014,7 @@
                 <w:color w:val="1E293B"/>
                 <w:sz w:val="20"/>
               </w:rPr>
-              <w:t xml:space="preserve">  ✔ Calificador Determinista (evaluateQuiz) (2.0376ms)</w:t>
+              <w:t>&gt; yapu@1.0.0 test:e2e</w:t>
               <w:br/>
             </w:r>
             <w:r>
@@ -9399,7 +10023,7 @@
                 <w:color w:val="1E293B"/>
                 <w:sz w:val="20"/>
               </w:rPr>
-              <w:t>✔ Nivel 1: Pruebas Unitarias - Motor de IA Determinista YAPU (5.2422ms)</w:t>
+              <w:t>&gt; playwright test</w:t>
               <w:br/>
             </w:r>
             <w:r>
@@ -9408,7 +10032,6 @@
                 <w:color w:val="1E293B"/>
                 <w:sz w:val="20"/>
               </w:rPr>
-              <w:t>▶ Nivel 1: Arquitectura Hexagonal y Principios SOLID</w:t>
               <w:br/>
             </w:r>
             <w:r>
@@ -9417,7 +10040,7 @@
                 <w:color w:val="1E293B"/>
                 <w:sz w:val="20"/>
               </w:rPr>
-              <w:t xml:space="preserve">  ▶ Value Objects del Dominio</w:t>
+              <w:t>Running 10 tests using 1 worker</w:t>
               <w:br/>
             </w:r>
             <w:r>
@@ -9426,7 +10049,6 @@
                 <w:color w:val="1E293B"/>
                 <w:sz w:val="20"/>
               </w:rPr>
-              <w:t xml:space="preserve">    ✔ PuntuacionVO: debe validar rango [0, 100] y umbral del 70% (1.4213ms)</w:t>
               <w:br/>
             </w:r>
             <w:r>
@@ -9435,7 +10057,7 @@
                 <w:color w:val="1E293B"/>
                 <w:sz w:val="20"/>
               </w:rPr>
-              <w:t xml:space="preserve">    ✔ NivelIdVO: debe restringir niveles estrictamente al rango de 1 a 10 (0.3311ms)</w:t>
+              <w:t xml:space="preserve">  ok  1 [Desktop Chrome] › tests/e2e/pwa-student-journey.spec.ts:01. Pantalla de Inicio (Landing Page): Carga y branding cultural (1.1s)</w:t>
               <w:br/>
             </w:r>
             <w:r>
@@ -9444,7 +10066,7 @@
                 <w:color w:val="1E293B"/>
                 <w:sz w:val="20"/>
               </w:rPr>
-              <w:t xml:space="preserve">    ✔ TerminoQuechuaVO: debe validar no vacio y normalizar (0.5403ms)</w:t>
+              <w:t xml:space="preserve">  ok  2 [Desktop Chrome] › tests/e2e/pwa-student-journey.spec.ts:02. Pantalla de Tablero (Dashboard) y Metricas del Estudiante (790ms)</w:t>
               <w:br/>
             </w:r>
             <w:r>
@@ -9453,7 +10075,7 @@
                 <w:color w:val="1E293B"/>
                 <w:sz w:val="20"/>
               </w:rPr>
-              <w:t xml:space="preserve">  ✔ Value Objects del Dominio (2.7755ms)</w:t>
+              <w:t xml:space="preserve">  ok  3 [Desktop Chrome] › tests/e2e/pwa-student-journey.spec.ts:03. Pantalla de Leccion (Flashcards): Interaccion y volteo de tarjeta (729ms)</w:t>
               <w:br/>
             </w:r>
             <w:r>
@@ -9462,7 +10084,7 @@
                 <w:color w:val="1E293B"/>
                 <w:sz w:val="20"/>
               </w:rPr>
-              <w:t xml:space="preserve">  ▶ Factory Method: EvaluacionFactory</w:t>
+              <w:t xml:space="preserve">  ok  4 [Desktop Chrome] › tests/e2e/pwa-student-journey.spec.ts:04. Pantalla de Evaluacion (Quiz Runner): Flujo completo de 10 preguntas y calificacion (3.3s)</w:t>
               <w:br/>
             </w:r>
             <w:r>
@@ -9471,7 +10093,7 @@
                 <w:color w:val="1E293B"/>
                 <w:sz w:val="20"/>
               </w:rPr>
-              <w:t xml:space="preserve">    ✔ debe crear una evaluacion valida con invariantes respetadas (0.8759ms)</w:t>
+              <w:t xml:space="preserve">  ok  5 [Desktop Chrome] › tests/e2e/pwa-student-journey.spec.ts:05. Pantallas Administrativas: Gestion Docente y Comunidad (796ms)</w:t>
               <w:br/>
             </w:r>
             <w:r>
@@ -9480,7 +10102,7 @@
                 <w:color w:val="1E293B"/>
                 <w:sz w:val="20"/>
               </w:rPr>
-              <w:t xml:space="preserve">    ✔ debe rechazar aciertos negativos o mayores al total de preguntas (0.1433ms)</w:t>
+              <w:t xml:space="preserve">  ok  6 [Mobile Android (PWA)] › tests/e2e/pwa-student-journey.spec.ts:01. Pantalla de Inicio (Landing Page): Carga y branding cultural (884ms)</w:t>
               <w:br/>
             </w:r>
             <w:r>
@@ -9489,7 +10111,7 @@
                 <w:color w:val="1E293B"/>
                 <w:sz w:val="20"/>
               </w:rPr>
-              <w:t xml:space="preserve">  ✔ Factory Method: EvaluacionFactory (1.1225ms)</w:t>
+              <w:t xml:space="preserve">  ok  7 [Mobile Android (PWA)] › tests/e2e/pwa-student-journey.spec.ts:02. Pantalla de Tablero (Dashboard) y Metricas del Estudiante (877ms)</w:t>
               <w:br/>
             </w:r>
             <w:r>
@@ -9498,7 +10120,7 @@
                 <w:color w:val="1E293B"/>
                 <w:sz w:val="20"/>
               </w:rPr>
-              <w:t xml:space="preserve">  ▶ Caso de Uso: CalificarEvaluacionUseCase con Inyeccion de Dependencias</w:t>
+              <w:t xml:space="preserve">  ok  8 [Mobile Android (PWA)] › tests/e2e/pwa-student-journey.spec.ts:03. Pantalla de Leccion (Flashcards): Interaccion y volteo de tarjeta (875ms)</w:t>
               <w:br/>
             </w:r>
             <w:r>
@@ -9507,7 +10129,7 @@
                 <w:color w:val="1E293B"/>
                 <w:sz w:val="20"/>
               </w:rPr>
-              <w:t xml:space="preserve">    ✔ debe calificar, delegar al repositorio a traves del puerto y retornar el resultado (0.2878ms)</w:t>
+              <w:t xml:space="preserve">  ok  9 [Mobile Android (PWA)] › tests/e2e/pwa-student-journey.spec.ts:04. Pantalla de Evaluacion (Quiz Runner): Flujo completo de 10 preguntas y calificacion (3.6s)</w:t>
               <w:br/>
             </w:r>
             <w:r>
@@ -9516,7 +10138,7 @@
                 <w:color w:val="1E293B"/>
                 <w:sz w:val="20"/>
               </w:rPr>
-              <w:t xml:space="preserve">  ✔ Caso de Uso: CalificarEvaluacionUseCase con Inyeccion de Dependencias (0.5802ms)</w:t>
+              <w:t xml:space="preserve">  ok 10 [Mobile Android (PWA)] › tests/e2e/pwa-student-journey.spec.ts:05. Pantallas Administrativas: Gestion Docente y Comunidad (873ms)</w:t>
               <w:br/>
             </w:r>
             <w:r>
@@ -9525,7 +10147,6 @@
                 <w:color w:val="1E293B"/>
                 <w:sz w:val="20"/>
               </w:rPr>
-              <w:t>✔ Nivel 1: Arquitectura Hexagonal y Principios SOLID (4.9515ms)</w:t>
               <w:br/>
             </w:r>
             <w:r>
@@ -9534,133 +10155,7 @@
                 <w:color w:val="1E293B"/>
                 <w:sz w:val="20"/>
               </w:rPr>
-              <w:t>▶ Nivel 1: Pruebas con Mocks y Stubs - LocalRepository (IndexedDB / LocalStorage)</w:t>
-              <w:br/>
-            </w:r>
-            <w:r>
-              <w:rPr>
-                <w:rFonts w:ascii="Consolas" w:hAnsi="Consolas"/>
-                <w:color w:val="1E293B"/>
-                <w:sz w:val="20"/>
-              </w:rPr>
-              <w:t xml:space="preserve">  ✔ debe devolver el perfil por defecto y guardarlo si el almacenamiento esta vacio (0.7606ms)</w:t>
-              <w:br/>
-            </w:r>
-            <w:r>
-              <w:rPr>
-                <w:rFonts w:ascii="Consolas" w:hAnsi="Consolas"/>
-                <w:color w:val="1E293B"/>
-                <w:sz w:val="20"/>
-              </w:rPr>
-              <w:t xml:space="preserve">  ✔ debe desbloquear el nivel siguiente y sumar 100 puntos de experiencia (0.1943ms)</w:t>
-              <w:br/>
-            </w:r>
-            <w:r>
-              <w:rPr>
-                <w:rFonts w:ascii="Consolas" w:hAnsi="Consolas"/>
-                <w:color w:val="1E293B"/>
-                <w:sz w:val="20"/>
-              </w:rPr>
-              <w:t xml:space="preserve">  ✔ no debe permitir desbloquear niveles superiores al maximo permitido (nivel 10) (0.1865ms)</w:t>
-              <w:br/>
-            </w:r>
-            <w:r>
-              <w:rPr>
-                <w:rFonts w:ascii="Consolas" w:hAnsi="Consolas"/>
-                <w:color w:val="1E293B"/>
-                <w:sz w:val="20"/>
-              </w:rPr>
-              <w:t xml:space="preserve">  ✔ debe marcar una palabra como aprendida e incrementar el contador de aciertos (0.2936ms)</w:t>
-              <w:br/>
-            </w:r>
-            <w:r>
-              <w:rPr>
-                <w:rFonts w:ascii="Consolas" w:hAnsi="Consolas"/>
-                <w:color w:val="1E293B"/>
-                <w:sz w:val="20"/>
-              </w:rPr>
-              <w:t xml:space="preserve">  ✔ debe almacenar una evaluacion y encolarla en la cola de sincronizacion offline cuando no hay red (0.501ms)</w:t>
-              <w:br/>
-            </w:r>
-            <w:r>
-              <w:rPr>
-                <w:rFonts w:ascii="Consolas" w:hAnsi="Consolas"/>
-                <w:color w:val="1E293B"/>
-                <w:sz w:val="20"/>
-              </w:rPr>
-              <w:t>✔ Nivel 1: Pruebas con Mocks y Stubs - LocalRepository (IndexedDB / LocalStorage) (2.784ms)</w:t>
-              <w:br/>
-            </w:r>
-            <w:r>
-              <w:rPr>
-                <w:rFonts w:ascii="Consolas" w:hAnsi="Consolas"/>
-                <w:color w:val="1E293B"/>
-                <w:sz w:val="20"/>
-              </w:rPr>
-              <w:t>ℹ tests 18</w:t>
-              <w:br/>
-            </w:r>
-            <w:r>
-              <w:rPr>
-                <w:rFonts w:ascii="Consolas" w:hAnsi="Consolas"/>
-                <w:color w:val="1E293B"/>
-                <w:sz w:val="20"/>
-              </w:rPr>
-              <w:t>ℹ suites 8</w:t>
-              <w:br/>
-            </w:r>
-            <w:r>
-              <w:rPr>
-                <w:rFonts w:ascii="Consolas" w:hAnsi="Consolas"/>
-                <w:color w:val="1E293B"/>
-                <w:sz w:val="20"/>
-              </w:rPr>
-              <w:t>ℹ pass 18</w:t>
-              <w:br/>
-            </w:r>
-            <w:r>
-              <w:rPr>
-                <w:rFonts w:ascii="Consolas" w:hAnsi="Consolas"/>
-                <w:color w:val="1E293B"/>
-                <w:sz w:val="20"/>
-              </w:rPr>
-              <w:t>ℹ fail 0</w:t>
-              <w:br/>
-            </w:r>
-            <w:r>
-              <w:rPr>
-                <w:rFonts w:ascii="Consolas" w:hAnsi="Consolas"/>
-                <w:color w:val="1E293B"/>
-                <w:sz w:val="20"/>
-              </w:rPr>
-              <w:t>ℹ cancelled 0</w:t>
-              <w:br/>
-            </w:r>
-            <w:r>
-              <w:rPr>
-                <w:rFonts w:ascii="Consolas" w:hAnsi="Consolas"/>
-                <w:color w:val="1E293B"/>
-                <w:sz w:val="20"/>
-              </w:rPr>
-              <w:t>ℹ skipped 0</w:t>
-              <w:br/>
-            </w:r>
-            <w:r>
-              <w:rPr>
-                <w:rFonts w:ascii="Consolas" w:hAnsi="Consolas"/>
-                <w:color w:val="1E293B"/>
-                <w:sz w:val="20"/>
-              </w:rPr>
-              <w:t>ℹ todo 0</w:t>
-              <w:br/>
-            </w:r>
-            <w:r>
-              <w:rPr>
-                <w:rFonts w:ascii="Consolas" w:hAnsi="Consolas"/>
-                <w:color w:val="1E293B"/>
-                <w:sz w:val="20"/>
-              </w:rPr>
-              <w:t>ℹ duration_ms 122.4293</w:t>
+              <w:t xml:space="preserve">  10 passed (17.1s)</w:t>
             </w:r>
           </w:p>
         </w:tc>

</xml_diff>